<commit_message>
refactor: generalize analog current-loop and discrete digital I/O terminology across resume and site
</commit_message>
<xml_diff>
--- a/my-next-app/public/Alexander_Bernal_Resume.docx
+++ b/my-next-app/public/Alexander_Bernal_Resume.docx
@@ -224,7 +224,7 @@
               <w:spacing w:after="40"/>
             </w:pPr>
             <w:r>
-              <w:t>Closed-Loop Actuator/Pump Control, Self-Healing Protocol State Machines, OPC UA, Modbus (TCP/IP &amp; RTU), MQTT, 4–20mA Analog Current Loops, 5V Discrete Digital I/O, PLCs &amp; Ladder Logic</w:t>
+              <w:t>Closed-Loop Actuator/Pump Control, Self-Healing Protocol State Machines, OPC UA, Modbus (TCP/IP &amp; RTU), MQTT, Analog Current Loops, Discrete Digital I/O, PLCs &amp; Ladder Logic</w:t>
             </w:r>
           </w:p>
         </w:tc>
@@ -479,7 +479,7 @@
         <w:t xml:space="preserve">Multi-Protocol Sensor &amp; Actuator Integration: </w:t>
       </w:r>
       <w:r>
-        <w:t>Developed production C/C++ firmware and Python/Bash daemons to orchestrate multi-vendor industrial sensors, variable-rate dosing pumps, and PLCs across OPC UA, Modbus (TCP/IP &amp; RTU), 4–20mA analog current loops, and 5V discrete Digital I/O signaling networks, routing real-time telemetry via MQTT.</w:t>
+        <w:t>Developed production C/C++ firmware and Python/Bash daemons to orchestrate multi-vendor industrial sensors, variable-rate dosing pumps, and PLCs across OPC UA, Modbus (TCP/IP &amp; RTU), analog current-loop signaling, and discrete Digital I/O networks, routing real-time telemetry via MQTT.</w:t>
       </w:r>
     </w:p>
     <w:p>

</xml_diff>

<commit_message>
Refine resume framing: disarm interview landmines, standardize Analog & Digital I/O, and emphasize systems architecture + agentic execution
</commit_message>
<xml_diff>
--- a/my-next-app/public/Alexander_Bernal_Resume.docx
+++ b/my-next-app/public/Alexander_Bernal_Resume.docx
@@ -69,7 +69,7 @@
         <w:spacing w:after="140"/>
       </w:pPr>
       <w:r>
-        <w:t>Senior Embedded Linux, Cyber-Physical Systems (IIoT/Robotics) &amp; AI-Augmented Software Engineer with 7+ years of experience architecting fault-tolerant edge firmware, closed-loop sensor-to-actuator control systems, and enterprise digitization platforms deployed across 20+ countries spanning 6 continents. Proven track record of taking industrial hardware-software systems from bare-metal and Embedded Linux bring-up to global commercial scale, masking hardware-layer instability through self-healing protocol state machines, and pioneering agentic engineering workflows (Claude Code, Google Antigravity, Gemini) to accelerate C/C++, Python, and full-stack TypeScript delivery.</w:t>
+        <w:t>Senior Embedded Systems and Industrial IoT (IIoT) Engineer with 7+ years of experience architecting fault-tolerant edge software, closed-loop sensor-to-actuator control systems, and enterprise digitization platforms deployed across 20+ countries spanning 6 continents (12 years total industrial R&amp;D and automation tenure). Specializes in bridging physical hardware with cloud infrastructure, masking field-hardware instability through self-healing protocol state machines, and leveraging agentic AI workflows (Claude Code, Google Antigravity, Gemini) with strict architectural guardrails to deliver production systems across C/C++, Python, Bash, and TypeScript.</w:t>
       </w:r>
     </w:p>
     <w:p>
@@ -117,7 +117,7 @@
                 <w:b/>
                 <w:color w:val="1E293B"/>
               </w:rPr>
-              <w:t>Languages</w:t>
+              <w:t>Systems &amp; Languages</w:t>
             </w:r>
           </w:p>
         </w:tc>
@@ -136,7 +136,7 @@
               <w:spacing w:after="40"/>
             </w:pPr>
             <w:r>
-              <w:t>C, C++, Python, Bash, TypeScript, JavaScript, SQL, x86 Assembly</w:t>
+              <w:t>Systems Architecture, Python, C, C++, Bash, TypeScript, JavaScript, SQL</w:t>
             </w:r>
           </w:p>
         </w:tc>
@@ -161,7 +161,7 @@
                 <w:b/>
                 <w:color w:val="1E293B"/>
               </w:rPr>
-              <w:t>Embedded Linux &amp; Fleet Ops</w:t>
+              <w:t>Embedded Linux &amp; Edge Ops</w:t>
             </w:r>
           </w:p>
         </w:tc>
@@ -180,7 +180,7 @@
               <w:spacing w:after="40"/>
             </w:pPr>
             <w:r>
-              <w:t>Embedded Linux (Ubuntu/Kernel/User-Space), Cross-Compilation Toolchains, Azure IoT, Docker, Watchdog &amp; Fail-Safe OTA</w:t>
+              <w:t>Embedded Linux (Ubuntu, User-Space Daemons, System &amp; Network Configuration), Azure IoT, Docker, Remote Fleet Upgrades &amp; Watchdog Recovery</w:t>
             </w:r>
           </w:p>
         </w:tc>
@@ -205,7 +205,7 @@
                 <w:b/>
                 <w:color w:val="1E293B"/>
               </w:rPr>
-              <w:t>Robotics, Fieldbus &amp; I/O</w:t>
+              <w:t>Industrial I/O &amp; Fieldbus</w:t>
             </w:r>
           </w:p>
         </w:tc>
@@ -224,7 +224,7 @@
               <w:spacing w:after="40"/>
             </w:pPr>
             <w:r>
-              <w:t>Closed-Loop Actuator/Pump Control, Self-Healing Protocol State Machines, OPC UA, Modbus (TCP/IP &amp; RTU), MQTT, Analog Current Loops, Discrete Digital I/O, PLCs &amp; Ladder Logic</w:t>
+              <w:t>Closed-Loop Actuator/Pump Control, Self-Healing Protocol State Machines, OPC UA, Modbus (TCP/IP &amp; RTU), MQTT, Analog &amp; Digital I/O, PLCs &amp; Ladder Logic</w:t>
             </w:r>
           </w:p>
         </w:tc>
@@ -268,7 +268,7 @@
               <w:spacing w:after="40"/>
             </w:pPr>
             <w:r>
-              <w:t>Claude Code, Google Antigravity (agy), Gemini, Context Architecture (CLAUDE.md / AGENTS.md), Compiler-Driven Agentic Verification, Automated Test &amp; Refactoring Workflows</w:t>
+              <w:t>Claude Code, Google Antigravity (agy), Gemini, Context Architecture (CLAUDE.md / AGENTS.md), Automated Verification &amp; Cross-Language Refactoring</w:t>
             </w:r>
           </w:p>
         </w:tc>
@@ -376,10 +376,10 @@
         <w:rPr>
           <w:b/>
         </w:rPr>
-        <w:t xml:space="preserve">Global Cyber-Physical Architecture: </w:t>
+        <w:t xml:space="preserve">Global IIoT &amp; Closed-Loop Architecture: </w:t>
       </w:r>
       <w:r>
-        <w:t>Lead the end-to-end architecture, C/C++ firmware, and Embedded Linux software design for smart automated chemical dosing systems—orchestrating closed-loop sensor-to-actuator control from concept through global commercial deployment across 20+ countries spanning 6 continents.</w:t>
+        <w:t>Lead the end-to-end systems architecture, Embedded Linux software design, and firmware integration for smart automated chemical dosing systems—orchestrating closed-loop sensor-to-actuator control from concept through global commercial deployment across 20+ countries spanning 6 continents.</w:t>
       </w:r>
     </w:p>
     <w:p>
@@ -394,7 +394,7 @@
         <w:t xml:space="preserve">Self-Healing Fieldbus &amp; Hardware Fault Tolerance: </w:t>
       </w:r>
       <w:r>
-        <w:t>Engineered fault-tolerant Modbus (TCP/IP &amp; RTU), OPC UA, and MQTT communication state machines with automated session recovery and state reconciliation to mask unannounced 20–40 minute hardware resets on legacy third-party pump controllers—guaranteeing continuous closed-loop actuation with zero customer-visible disruption.</w:t>
+        <w:t>Engineered fault-tolerant Modbus (TCP/IP &amp; RTU), OPC UA, and MQTT communication state machines with automated session recovery and state reconciliation to mask unannounced 20–40 minute hardware resets on legacy third-party pump controllers—guaranteeing continuous closed-loop operation with zero customer-visible disruption.</w:t>
       </w:r>
     </w:p>
     <w:p>
@@ -409,7 +409,7 @@
         <w:t xml:space="preserve">Enterprise SME Knowledge Digitization: </w:t>
       </w:r>
       <w:r>
-        <w:t>Architected a guided technical configuration and decision-support platform that codifies Subject Matter Expert (SME) domain heuristics into a deterministic recommendation engine—automating equipment/chemistry selection and standardizing global commercial proposals.</w:t>
+        <w:t>Architected a guided technical configuration and decision-support platform that codifies Subject Matter Expert (SME) domain heuristics into a deterministic recommendation engine—automating equipment and chemistry selection to standardize global commercial proposals.</w:t>
       </w:r>
     </w:p>
     <w:p>
@@ -424,7 +424,7 @@
         <w:t xml:space="preserve">AI-Augmented Systems Engineering: </w:t>
       </w:r>
       <w:r>
-        <w:t>Pioneered agentic development workflows (Claude Code, declarative CLAUDE.md guardrails, and automated diagnostic tooling) to accelerate low-level protocol debugging, cross-OS refactoring, and CI/CD test verification.</w:t>
+        <w:t>Pioneered agentic development workflows (Claude Code, Google Antigravity, declarative CLAUDE.md / AGENTS.md context guardrails, and automated diagnostic tooling) to translate system architecture into verified C/C++, Python, and TypeScript implementations while accelerating protocol debugging and cross-OS refactoring.</w:t>
       </w:r>
     </w:p>
     <w:p>
@@ -439,7 +439,7 @@
         <w:t xml:space="preserve">Fleet OS Modernization &amp; Runtime Optimization: </w:t>
       </w:r>
       <w:r>
-        <w:t>Cross-compiled core C/C++ firmware toolchains to support remote in-field Embedded Linux LTS distribution upgrades, while replacing heavy containerized edge runtimes with lightweight native cloud SDK daemons (cutting firmware footprint by ~50%).</w:t>
+        <w:t>Ported and compiled core C/C++ edge software to support remote in-field Embedded Linux LTS distribution upgrades, while replacing heavy containerized edge runtimes with lightweight native cloud SDK daemons (cutting deployment footprint by ~50%).</w:t>
       </w:r>
     </w:p>
     <w:p>
@@ -479,7 +479,7 @@
         <w:t xml:space="preserve">Multi-Protocol Sensor &amp; Actuator Integration: </w:t>
       </w:r>
       <w:r>
-        <w:t>Developed production C/C++ firmware and Python/Bash daemons to orchestrate multi-vendor industrial sensors, variable-rate dosing pumps, and PLCs across OPC UA, Modbus (TCP/IP &amp; RTU), analog current-loop signaling, and discrete Digital I/O networks, routing real-time telemetry via MQTT.</w:t>
+        <w:t>Developed production edge software and Python/Bash/C++ daemons to integrate multi-vendor industrial sensors, variable-rate dosing pumps, and PLCs across OPC UA, Modbus (TCP/IP &amp; RTU), and analog/digital I/O networks, routing real-time telemetry to Azure IoT via MQTT.</w:t>
       </w:r>
     </w:p>
     <w:p>
@@ -494,7 +494,7 @@
         <w:t xml:space="preserve">Automated Provisioning &amp; Hardware Bring-Up: </w:t>
       </w:r>
       <w:r>
-        <w:t>Built Linux shell and Python automation frameworks to streamline industrial PC provisioning, network configuration, and hardware-in-the-loop field validation, significantly reducing manual commissioning time for global deployments.</w:t>
+        <w:t>Built Linux shell and Python automation frameworks to streamline industrial PC provisioning, network configuration, and hardware-in-the-loop validation, significantly reducing manual commissioning time for global deployments.</w:t>
       </w:r>
     </w:p>
     <w:p>
@@ -617,10 +617,10 @@
         <w:rPr>
           <w:b/>
         </w:rPr>
-        <w:t xml:space="preserve">AI-Native Systems Lab &amp; Technical Portfolio (bernalgorithm.github.io): </w:t>
+        <w:t xml:space="preserve">AI-Augmented Engineering Portfolio &amp; Systems Lab (bernalgorithm.github.io): </w:t>
       </w:r>
       <w:r>
-        <w:t>Designed and built a static-exported Next.js / TypeScript engineering lab notebook and interactive 60 FPS hardware simulation workbench using Google Antigravity and Gemini, enforcing strict architectural boundaries via AGENTS.md and compiler-verified GitHub Actions CI/CD pipelines.</w:t>
+        <w:t>Architected and deployed a statically exported Next.js and TypeScript technical portfolio and lab notebook using Google Antigravity and Gemini, enforcing declarative AGENTS.md context boundaries and automated GitHub Actions CI/CD pipelines.</w:t>
       </w:r>
     </w:p>
     <w:p>
@@ -673,10 +673,10 @@
         <w:rPr>
           <w:b/>
         </w:rPr>
-        <w:t xml:space="preserve">Academic Leadership: </w:t>
+        <w:t xml:space="preserve">Academic Focus: </w:t>
       </w:r>
       <w:r>
-        <w:t>Served as a university tutor and grader for Computer Science coursework, mentoring students through C++ object-oriented architecture, memory management, and debugging.</w:t>
+        <w:t>Served as a university tutor and grader for Computer Science coursework, guiding students through object-oriented programming implementations and debugging in C++.</w:t>
       </w:r>
     </w:p>
     <w:p>

</xml_diff>

<commit_message>
Add industrial edge networking, cellular gateways, DHCP, and NAT/port forwarding to resume
</commit_message>
<xml_diff>
--- a/my-next-app/public/Alexander_Bernal_Resume.docx
+++ b/my-next-app/public/Alexander_Bernal_Resume.docx
@@ -69,7 +69,7 @@
         <w:spacing w:after="140"/>
       </w:pPr>
       <w:r>
-        <w:t>Senior Embedded Systems and Industrial IoT (IIoT) Engineer with 7+ years of experience architecting fault-tolerant edge software, closed-loop sensor-to-actuator control systems, and enterprise digitization platforms deployed across 20+ countries spanning 6 continents (12 years total industrial R&amp;D and automation tenure). Specializes in bridging physical hardware with cloud infrastructure, masking field-hardware instability through self-healing protocol state machines, and leveraging agentic AI workflows (Claude Code, Google Antigravity, Gemini) with strict architectural guardrails to deliver production systems across C/C++, Python, Bash, and TypeScript.</w:t>
+        <w:t>Senior Embedded Systems and Industrial IoT (IIoT) Engineer with 7+ years of experience architecting fault-tolerant edge software, industrial cellular/network topologies, closed-loop sensor-to-actuator control systems, and enterprise digitization platforms deployed across 20+ countries spanning 6 continents (12 years total industrial R&amp;D and automation tenure). Specializes in bridging physical plant hardware with cloud infrastructure across industrial fieldbuses and cellular backhaul gateways, masking field-hardware instability through self-healing protocol state machines, and leveraging agentic AI workflows (Claude Code, Google Antigravity, Gemini) with strict architectural guardrails to deliver production systems across C/C++, Python, Bash, and TypeScript.</w:t>
       </w:r>
     </w:p>
     <w:p>
@@ -161,7 +161,7 @@
                 <w:b/>
                 <w:color w:val="1E293B"/>
               </w:rPr>
-              <w:t>Embedded Linux &amp; Edge Ops</w:t>
+              <w:t>Embedded Linux, Networking &amp; Edge Ops</w:t>
             </w:r>
           </w:p>
         </w:tc>
@@ -180,7 +180,7 @@
               <w:spacing w:after="40"/>
             </w:pPr>
             <w:r>
-              <w:t>Embedded Linux (Ubuntu, User-Space Daemons, System &amp; Network Configuration), Azure IoT, Docker, Remote Fleet Upgrades &amp; Watchdog Recovery</w:t>
+              <w:t>Embedded Linux (Ubuntu, User-Space Daemons), Cellular Gateways (Cradlepoint, Teltonika, MultiTech, Milesight), Embedded Cellular Modems &amp; Wi-Fi, DHCP Servers, NAT / Port Forwarding &amp; Subnet Routing, Azure IoT, Docker, Remote Fleet Upgrades</w:t>
             </w:r>
           </w:p>
         </w:tc>
@@ -379,7 +379,7 @@
         <w:t xml:space="preserve">Global IIoT &amp; Closed-Loop Architecture: </w:t>
       </w:r>
       <w:r>
-        <w:t>Lead the end-to-end systems architecture, Embedded Linux software design, and firmware integration for smart automated chemical dosing systems—orchestrating closed-loop sensor-to-actuator control from concept through global commercial deployment across 20+ countries spanning 6 continents.</w:t>
+        <w:t>Lead the end-to-end systems architecture, Embedded Linux software design, and field network integration for smart automated chemical dosing systems—orchestrating closed-loop sensor-to-actuator control from concept through global commercial deployment across 20+ countries spanning 6 continents.</w:t>
       </w:r>
     </w:p>
     <w:p>
@@ -491,10 +491,10 @@
         <w:rPr>
           <w:b/>
         </w:rPr>
-        <w:t xml:space="preserve">Automated Provisioning &amp; Hardware Bring-Up: </w:t>
+        <w:t xml:space="preserve">Industrial Edge Networking &amp; Cellular Backhaul: </w:t>
       </w:r>
       <w:r>
-        <w:t>Built Linux shell and Python automation frameworks to streamline industrial PC provisioning, network configuration, and hardware-in-the-loop validation, significantly reducing manual commissioning time for global deployments.</w:t>
+        <w:t>Designed and configured multi-device field networks behind dedicated cellular gateways (Cradlepoint, Teltonika, MultiTech, Milesight) as well as onboard embedded cellular modems and Wi-Fi interfaces on headless Linux SBCs—configuring DHCP servers, NAT / port-forwarding rules, and automated Linux provisioning scripts to streamline global hardware bring-up and remote diagnostics.</w:t>
       </w:r>
     </w:p>
     <w:p>

</xml_diff>

<commit_message>
Add GitHub Copilot and LoRa/LoRaWAN gateway communications to resume
</commit_message>
<xml_diff>
--- a/my-next-app/public/Alexander_Bernal_Resume.docx
+++ b/my-next-app/public/Alexander_Bernal_Resume.docx
@@ -69,7 +69,7 @@
         <w:spacing w:after="140"/>
       </w:pPr>
       <w:r>
-        <w:t>Senior Embedded Systems and Industrial IoT (IIoT) Engineer with 7+ years of experience architecting fault-tolerant edge software, industrial cellular/network topologies, closed-loop sensor-to-actuator control systems, and enterprise digitization platforms deployed across 20+ countries spanning 6 continents (12 years total industrial R&amp;D and automation tenure). Specializes in bridging physical plant hardware with cloud infrastructure across industrial fieldbuses and cellular backhaul gateways, masking field-hardware instability through self-healing protocol state machines, and leveraging agentic AI workflows (Claude Code, Google Antigravity, Gemini) with strict architectural guardrails to deliver production systems across C/C++, Python, Bash, and TypeScript.</w:t>
+        <w:t>Senior Embedded Systems and Industrial IoT (IIoT) Engineer with 7+ years of experience architecting fault-tolerant edge software, industrial cellular and LoRa network topologies, closed-loop sensor-to-actuator control systems, and enterprise digitization platforms deployed across 20+ countries spanning 6 continents (12 years total industrial R&amp;D and automation tenure). Specializes in bridging physical plant hardware with cloud infrastructure across industrial fieldbuses and wireless/cellular backhaul gateways, masking field-hardware instability through self-healing protocol state machines, and leveraging AI-augmented workflows (Claude Code, Google Antigravity, GitHub Copilot, Gemini) with strict architectural guardrails to deliver production systems across C/C++, Python, Bash, and TypeScript.</w:t>
       </w:r>
     </w:p>
     <w:p>
@@ -180,7 +180,7 @@
               <w:spacing w:after="40"/>
             </w:pPr>
             <w:r>
-              <w:t>Embedded Linux (Ubuntu, User-Space Daemons), Cellular Gateways (Cradlepoint, Teltonika, MultiTech, Milesight), Embedded Cellular Modems &amp; Wi-Fi, DHCP Servers, NAT / Port Forwarding &amp; Subnet Routing, Azure IoT, Docker, Remote Fleet Upgrades</w:t>
+              <w:t>Embedded Linux (Ubuntu, User-Space Daemons), Cellular &amp; LoRa Gateways (Cradlepoint, Teltonika, MultiTech, Milesight), LoRa / LoRaWAN, Embedded Cellular Modems &amp; Wi-Fi, DHCP Servers, NAT / Port Forwarding &amp; Subnet Routing, Azure IoT, Docker, Remote Fleet Upgrades</w:t>
             </w:r>
           </w:p>
         </w:tc>
@@ -268,7 +268,7 @@
               <w:spacing w:after="40"/>
             </w:pPr>
             <w:r>
-              <w:t>Claude Code, Google Antigravity (agy), Gemini, Context Architecture (CLAUDE.md / AGENTS.md), Automated Verification &amp; Cross-Language Refactoring</w:t>
+              <w:t>Claude Code, Google Antigravity (agy), GitHub Copilot, Gemini, Context Architecture (CLAUDE.md / AGENTS.md), Automated Verification &amp; Cross-Language Refactoring</w:t>
             </w:r>
           </w:p>
         </w:tc>
@@ -424,7 +424,7 @@
         <w:t xml:space="preserve">AI-Augmented Systems Engineering: </w:t>
       </w:r>
       <w:r>
-        <w:t>Pioneered agentic development workflows (Claude Code, Google Antigravity, declarative CLAUDE.md / AGENTS.md context guardrails, and automated diagnostic tooling) to translate system architecture into verified C/C++, Python, and TypeScript implementations while accelerating protocol debugging and cross-OS refactoring.</w:t>
+        <w:t>Pioneered AI-assisted and agentic development workflows (GitHub Copilot, Claude Code, Google Antigravity, declarative CLAUDE.md / AGENTS.md context guardrails, and automated diagnostic tooling) to translate system architecture into verified C/C++, Python, and TypeScript implementations while accelerating protocol debugging and cross-OS refactoring.</w:t>
       </w:r>
     </w:p>
     <w:p>
@@ -479,7 +479,7 @@
         <w:t xml:space="preserve">Multi-Protocol Sensor &amp; Actuator Integration: </w:t>
       </w:r>
       <w:r>
-        <w:t>Developed production edge software and Python/Bash/C++ daemons to integrate multi-vendor industrial sensors, variable-rate dosing pumps, and PLCs across OPC UA, Modbus (TCP/IP &amp; RTU), and analog/digital I/O networks, routing real-time telemetry to Azure IoT via MQTT.</w:t>
+        <w:t>Developed production edge software and Python/Bash/C++ daemons to integrate multi-vendor industrial sensors, variable-rate dosing pumps, and PLCs across OPC UA, Modbus (TCP/IP &amp; RTU), LoRa, and analog/digital I/O networks, routing real-time telemetry to Azure IoT via MQTT.</w:t>
       </w:r>
     </w:p>
     <w:p>
@@ -491,10 +491,10 @@
         <w:rPr>
           <w:b/>
         </w:rPr>
-        <w:t xml:space="preserve">Industrial Edge Networking &amp; Cellular Backhaul: </w:t>
+        <w:t xml:space="preserve">Industrial Edge Networking, Cellular &amp; LoRa Backhaul: </w:t>
       </w:r>
       <w:r>
-        <w:t>Designed and configured multi-device field networks behind dedicated cellular gateways (Cradlepoint, Teltonika, MultiTech, Milesight) as well as onboard embedded cellular modems and Wi-Fi interfaces on headless Linux SBCs—configuring DHCP servers, NAT / port-forwarding rules, and automated Linux provisioning scripts to streamline global hardware bring-up and remote diagnostics.</w:t>
+        <w:t>Designed and configured multi-device field networks across dedicated cellular and LoRa gateways (Cradlepoint, Teltonika, MultiTech, Milesight) as well as onboard embedded cellular modems and Wi-Fi interfaces on headless Linux SBCs—configuring DHCP servers, NAT / port-forwarding rules, and automated Linux provisioning scripts to streamline global hardware bring-up and remote diagnostics.</w:t>
       </w:r>
     </w:p>
     <w:p>

</xml_diff>

<commit_message>
Polish resume page, markdown, and downloadable DOCX for recruiter readability and clear impact
</commit_message>
<xml_diff>
--- a/my-next-app/public/Alexander_Bernal_Resume.docx
+++ b/my-next-app/public/Alexander_Bernal_Resume.docx
@@ -1,732 +1,732 @@
 
 <file path=word/document.xml><?xml version="1.0" encoding="utf-8"?>
-<w:document xmlns:wpc="http://schemas.microsoft.com/office/word/2010/wordprocessingCanvas" xmlns:mo="http://schemas.microsoft.com/office/mac/office/2008/main" xmlns:mc="http://schemas.openxmlformats.org/markup-compatibility/2006" xmlns:mv="urn:schemas-microsoft-com:mac:vml" xmlns:o="urn:schemas-microsoft-com:office:office" xmlns:r="http://schemas.openxmlformats.org/officeDocument/2006/relationships" xmlns:m="http://schemas.openxmlformats.org/officeDocument/2006/math" xmlns:v="urn:schemas-microsoft-com:vml" xmlns:wp14="http://schemas.microsoft.com/office/word/2010/wordprocessingDrawing" xmlns:wp="http://schemas.openxmlformats.org/drawingml/2006/wordprocessingDrawing" xmlns:w10="urn:schemas-microsoft-com:office:word" xmlns:w="http://schemas.openxmlformats.org/wordprocessingml/2006/main" xmlns:w14="http://schemas.microsoft.com/office/word/2010/wordml" xmlns:wpg="http://schemas.microsoft.com/office/word/2010/wordprocessingGroup" xmlns:wpi="http://schemas.microsoft.com/office/word/2010/wordprocessingInk" xmlns:wne="http://schemas.microsoft.com/office/word/2006/wordml" xmlns:wps="http://schemas.microsoft.com/office/word/2010/wordprocessingShape" mc:Ignorable="w14 wp14">
-  <w:body>
-    <w:tbl>
-      <w:tblPr>
-        <w:tblW w:type="auto" w:w="0"/>
-        <w:jc w:val="center"/>
-        <w:tblLayout w:type="fixed"/>
-        <w:tblLook w:firstColumn="1" w:firstRow="1" w:lastColumn="0" w:lastRow="0" w:noHBand="0" w:noVBand="1" w:val="04A0"/>
-      </w:tblPr>
-      <w:tblGrid>
-        <w:gridCol w:w="10800"/>
-      </w:tblGrid>
-      <w:tr>
-        <w:tc>
-          <w:tcPr>
-            <w:tcW w:type="dxa" w:w="10800"/>
-            <w:shd w:val="clear" w:color="auto" w:fill="1A2A3A"/>
-          </w:tcPr>
-          <w:p>
-            <w:pPr>
-              <w:spacing w:before="200"/>
-              <w:jc w:val="center"/>
-            </w:pPr>
-            <w:r>
-              <w:rPr>
-                <w:b/>
-                <w:color w:val="FFFFFF"/>
-                <w:sz w:val="44"/>
-              </w:rPr>
-              <w:t>ALEXANDER BERNAL</w:t>
-            </w:r>
-          </w:p>
-          <w:p>
-            <w:pPr>
-              <w:spacing w:after="200"/>
-              <w:jc w:val="center"/>
-            </w:pPr>
-            <w:r>
-              <w:rPr>
-                <w:color w:val="B0C4DE"/>
-                <w:sz w:val="18"/>
-              </w:rPr>
-              <w:t>901-220-1510  |  me@alexanderbernal.dev  |  linkedin.com/in/bernaale  |  github.com/bernalgorithm  |  Memphis, TN</w:t>
-            </w:r>
-          </w:p>
-        </w:tc>
-      </w:tr>
-    </w:tbl>
-    <w:p>
-      <w:pPr>
-        <w:pBdr>
-          <w:bottom w:val="single" w:sz="12" w:space="1" w:color="CBD5E1"/>
-        </w:pBdr>
-        <w:spacing w:before="220" w:after="70"/>
-      </w:pPr>
-      <w:r>
-        <w:rPr>
-          <w:b/>
-          <w:color w:val="1A2A3A"/>
-          <w:sz w:val="22"/>
-        </w:rPr>
-        <w:t>PROFESSIONAL SUMMARY</w:t>
-      </w:r>
-    </w:p>
-    <w:p>
-      <w:pPr>
-        <w:spacing w:after="140"/>
-      </w:pPr>
-      <w:r>
-        <w:t>Senior Embedded Systems and Industrial IoT (IIoT) Engineer with 7+ years of experience architecting fault-tolerant edge software, industrial cellular and LoRa network topologies, closed-loop sensor-to-actuator control systems, and enterprise digitization platforms deployed across 20+ countries spanning 6 continents (12 years total industrial R&amp;D and automation tenure). Specializes in bridging physical plant hardware with cloud infrastructure across industrial fieldbuses and wireless/cellular backhaul gateways, masking field-hardware instability through self-healing protocol state machines, and leveraging AI-augmented workflows (Claude Code, Google Antigravity, GitHub Copilot, Gemini) with strict architectural guardrails to deliver production systems across C/C++, Python, Bash, and TypeScript.</w:t>
-      </w:r>
-    </w:p>
-    <w:p>
-      <w:pPr>
-        <w:pBdr>
-          <w:bottom w:val="single" w:sz="12" w:space="1" w:color="CBD5E1"/>
-        </w:pBdr>
-        <w:spacing w:before="220" w:after="70"/>
-      </w:pPr>
-      <w:r>
-        <w:rPr>
-          <w:b/>
-          <w:color w:val="1A2A3A"/>
-          <w:sz w:val="22"/>
-        </w:rPr>
-        <w:t>TECHNICAL SKILLS</w:t>
-      </w:r>
-    </w:p>
-    <w:tbl>
-      <w:tblPr>
-        <w:tblW w:type="auto" w:w="0"/>
-        <w:tblLook w:firstColumn="1" w:firstRow="1" w:lastColumn="0" w:lastRow="0" w:noHBand="0" w:noVBand="1" w:val="04A0"/>
-      </w:tblPr>
-      <w:tblGrid>
-        <w:gridCol w:w="3000"/>
-        <w:gridCol w:w="7800"/>
-      </w:tblGrid>
-      <w:tr>
-        <w:tc>
-          <w:tcPr>
-            <w:tcW w:type="dxa" w:w="3000"/>
-            <w:tcBorders>
-              <w:top w:val="nil"/>
-              <w:left w:val="nil"/>
-              <w:bottom w:val="nil"/>
-              <w:right w:val="nil"/>
-            </w:tcBorders>
-          </w:tcPr>
-          <w:p>
-            <w:pPr>
-              <w:spacing w:after="40"/>
-            </w:pPr>
-            <w:r>
-              <w:rPr>
-                <w:b/>
-                <w:color w:val="1E293B"/>
-              </w:rPr>
-              <w:t>Systems &amp; Languages</w:t>
-            </w:r>
-          </w:p>
-        </w:tc>
-        <w:tc>
-          <w:tcPr>
-            <w:tcW w:type="dxa" w:w="7800"/>
-            <w:tcBorders>
-              <w:top w:val="nil"/>
-              <w:left w:val="nil"/>
-              <w:bottom w:val="nil"/>
-              <w:right w:val="nil"/>
-            </w:tcBorders>
-          </w:tcPr>
-          <w:p>
-            <w:pPr>
-              <w:spacing w:after="40"/>
-            </w:pPr>
-            <w:r>
-              <w:t>Systems Architecture, Python, C, C++, Bash, TypeScript, JavaScript, SQL</w:t>
-            </w:r>
-          </w:p>
-        </w:tc>
-      </w:tr>
-      <w:tr>
-        <w:tc>
-          <w:tcPr>
-            <w:tcW w:type="dxa" w:w="3000"/>
-            <w:tcBorders>
-              <w:top w:val="nil"/>
-              <w:left w:val="nil"/>
-              <w:bottom w:val="nil"/>
-              <w:right w:val="nil"/>
-            </w:tcBorders>
-          </w:tcPr>
-          <w:p>
-            <w:pPr>
-              <w:spacing w:after="40"/>
-            </w:pPr>
-            <w:r>
-              <w:rPr>
-                <w:b/>
-                <w:color w:val="1E293B"/>
-              </w:rPr>
-              <w:t>Embedded Linux, Networking &amp; Edge Ops</w:t>
-            </w:r>
-          </w:p>
-        </w:tc>
-        <w:tc>
-          <w:tcPr>
-            <w:tcW w:type="dxa" w:w="7800"/>
-            <w:tcBorders>
-              <w:top w:val="nil"/>
-              <w:left w:val="nil"/>
-              <w:bottom w:val="nil"/>
-              <w:right w:val="nil"/>
-            </w:tcBorders>
-          </w:tcPr>
-          <w:p>
-            <w:pPr>
-              <w:spacing w:after="40"/>
-            </w:pPr>
-            <w:r>
-              <w:t>Embedded Linux (Ubuntu, User-Space Daemons), Cellular &amp; LoRa Gateways (Cradlepoint, Teltonika, MultiTech, Milesight), LoRa / LoRaWAN, Embedded Cellular Modems &amp; Wi-Fi, DHCP Servers, NAT / Port Forwarding &amp; Subnet Routing, Azure IoT, Docker, Remote Fleet Upgrades</w:t>
-            </w:r>
-          </w:p>
-        </w:tc>
-      </w:tr>
-      <w:tr>
-        <w:tc>
-          <w:tcPr>
-            <w:tcW w:type="dxa" w:w="3000"/>
-            <w:tcBorders>
-              <w:top w:val="nil"/>
-              <w:left w:val="nil"/>
-              <w:bottom w:val="nil"/>
-              <w:right w:val="nil"/>
-            </w:tcBorders>
-          </w:tcPr>
-          <w:p>
-            <w:pPr>
-              <w:spacing w:after="40"/>
-            </w:pPr>
-            <w:r>
-              <w:rPr>
-                <w:b/>
-                <w:color w:val="1E293B"/>
-              </w:rPr>
-              <w:t>Industrial I/O &amp; Fieldbus</w:t>
-            </w:r>
-          </w:p>
-        </w:tc>
-        <w:tc>
-          <w:tcPr>
-            <w:tcW w:type="dxa" w:w="7800"/>
-            <w:tcBorders>
-              <w:top w:val="nil"/>
-              <w:left w:val="nil"/>
-              <w:bottom w:val="nil"/>
-              <w:right w:val="nil"/>
-            </w:tcBorders>
-          </w:tcPr>
-          <w:p>
-            <w:pPr>
-              <w:spacing w:after="40"/>
-            </w:pPr>
-            <w:r>
-              <w:t>Closed-Loop Actuator/Pump Control, Self-Healing Protocol State Machines, OPC UA, Modbus (TCP/IP &amp; RTU), MQTT, Analog &amp; Digital I/O, PLCs &amp; Ladder Logic</w:t>
-            </w:r>
-          </w:p>
-        </w:tc>
-      </w:tr>
-      <w:tr>
-        <w:tc>
-          <w:tcPr>
-            <w:tcW w:type="dxa" w:w="3000"/>
-            <w:tcBorders>
-              <w:top w:val="nil"/>
-              <w:left w:val="nil"/>
-              <w:bottom w:val="nil"/>
-              <w:right w:val="nil"/>
-            </w:tcBorders>
-          </w:tcPr>
-          <w:p>
-            <w:pPr>
-              <w:spacing w:after="40"/>
-            </w:pPr>
-            <w:r>
-              <w:rPr>
-                <w:b/>
-                <w:color w:val="1E293B"/>
-              </w:rPr>
-              <w:t>AI &amp; Agentic Engineering</w:t>
-            </w:r>
-          </w:p>
-        </w:tc>
-        <w:tc>
-          <w:tcPr>
-            <w:tcW w:type="dxa" w:w="7800"/>
-            <w:tcBorders>
-              <w:top w:val="nil"/>
-              <w:left w:val="nil"/>
-              <w:bottom w:val="nil"/>
-              <w:right w:val="nil"/>
-            </w:tcBorders>
-          </w:tcPr>
-          <w:p>
-            <w:pPr>
-              <w:spacing w:after="40"/>
-            </w:pPr>
-            <w:r>
-              <w:t>Claude Code, Google Antigravity (agy), GitHub Copilot, Gemini, Context Architecture (CLAUDE.md / AGENTS.md), Automated Verification &amp; Cross-Language Refactoring</w:t>
-            </w:r>
-          </w:p>
-        </w:tc>
-      </w:tr>
-      <w:tr>
-        <w:tc>
-          <w:tcPr>
-            <w:tcW w:type="dxa" w:w="3000"/>
-            <w:tcBorders>
-              <w:top w:val="nil"/>
-              <w:left w:val="nil"/>
-              <w:bottom w:val="nil"/>
-              <w:right w:val="nil"/>
-            </w:tcBorders>
-          </w:tcPr>
-          <w:p>
-            <w:pPr>
-              <w:spacing w:after="40"/>
-            </w:pPr>
-            <w:r>
-              <w:rPr>
-                <w:b/>
-                <w:color w:val="1E293B"/>
-              </w:rPr>
-              <w:t>Full-Stack &amp; Digitization</w:t>
-            </w:r>
-          </w:p>
-        </w:tc>
-        <w:tc>
-          <w:tcPr>
-            <w:tcW w:type="dxa" w:w="7800"/>
-            <w:tcBorders>
-              <w:top w:val="nil"/>
-              <w:left w:val="nil"/>
-              <w:bottom w:val="nil"/>
-              <w:right w:val="nil"/>
-            </w:tcBorders>
-          </w:tcPr>
-          <w:p>
-            <w:pPr>
-              <w:spacing w:after="40"/>
-            </w:pPr>
-            <w:r>
-              <w:t>Rule-Based Decision Engines, React / Next.js, Tailwind CSS, Firebase / Firestore, GitHub Actions (CI/CD), Azure DevOps, Git</w:t>
-            </w:r>
-          </w:p>
-        </w:tc>
-      </w:tr>
-    </w:tbl>
-    <w:p>
-      <w:pPr>
-        <w:pBdr>
-          <w:bottom w:val="single" w:sz="12" w:space="1" w:color="CBD5E1"/>
-        </w:pBdr>
-        <w:spacing w:before="220" w:after="70"/>
-      </w:pPr>
-      <w:r>
-        <w:rPr>
-          <w:b/>
-          <w:color w:val="1A2A3A"/>
-          <w:sz w:val="22"/>
-        </w:rPr>
-        <w:t>PROFESSIONAL EXPERIENCE</w:t>
-      </w:r>
-    </w:p>
-    <w:p>
-      <w:pPr>
-        <w:tabs>
-          <w:tab w:pos="10800" w:val="right"/>
-        </w:tabs>
-        <w:spacing w:before="140" w:after="40"/>
-      </w:pPr>
-      <w:r>
-        <w:rPr>
-          <w:b/>
-          <w:color w:val="0F172A"/>
-          <w:sz w:val="22"/>
-        </w:rPr>
-        <w:t xml:space="preserve">Buckman – </w:t>
-      </w:r>
-      <w:r>
-        <w:rPr>
-          <w:b/>
-          <w:i/>
-          <w:color w:val="334155"/>
-        </w:rPr>
-        <w:t>Digital Innovation Engineer</w:t>
-      </w:r>
-      <w:r>
-        <w:rPr>
-          <w:b/>
-          <w:color w:val="64748B"/>
-          <w:sz w:val="19"/>
-        </w:rPr>
-        <w:tab/>
-        <w:t>March 2022 – Present</w:t>
-      </w:r>
-    </w:p>
-    <w:p>
-      <w:pPr>
-        <w:pStyle w:val="ListBullet"/>
-        <w:spacing w:after="40"/>
-      </w:pPr>
-      <w:r>
-        <w:rPr>
-          <w:b/>
-        </w:rPr>
-        <w:t xml:space="preserve">Global IIoT &amp; Closed-Loop Architecture: </w:t>
-      </w:r>
-      <w:r>
-        <w:t>Lead the end-to-end systems architecture, Embedded Linux software design, and field network integration for smart automated chemical dosing systems—orchestrating closed-loop sensor-to-actuator control from concept through global commercial deployment across 20+ countries spanning 6 continents.</w:t>
-      </w:r>
-    </w:p>
-    <w:p>
-      <w:pPr>
-        <w:pStyle w:val="ListBullet"/>
-        <w:spacing w:after="40"/>
-      </w:pPr>
-      <w:r>
-        <w:rPr>
-          <w:b/>
-        </w:rPr>
-        <w:t xml:space="preserve">Self-Healing Fieldbus &amp; Hardware Fault Tolerance: </w:t>
-      </w:r>
-      <w:r>
-        <w:t>Engineered fault-tolerant Modbus (TCP/IP &amp; RTU), OPC UA, and MQTT communication state machines with automated session recovery and state reconciliation to mask unannounced 20–40 minute hardware resets on legacy third-party pump controllers—guaranteeing continuous closed-loop operation with zero customer-visible disruption.</w:t>
-      </w:r>
-    </w:p>
-    <w:p>
-      <w:pPr>
-        <w:pStyle w:val="ListBullet"/>
-        <w:spacing w:after="40"/>
-      </w:pPr>
-      <w:r>
-        <w:rPr>
-          <w:b/>
-        </w:rPr>
-        <w:t xml:space="preserve">Enterprise SME Knowledge Digitization: </w:t>
-      </w:r>
-      <w:r>
-        <w:t>Architected a guided technical configuration and decision-support platform that codifies Subject Matter Expert (SME) domain heuristics into a deterministic recommendation engine—automating equipment and chemistry selection to standardize global commercial proposals.</w:t>
-      </w:r>
-    </w:p>
-    <w:p>
-      <w:pPr>
-        <w:pStyle w:val="ListBullet"/>
-        <w:spacing w:after="40"/>
-      </w:pPr>
-      <w:r>
-        <w:rPr>
-          <w:b/>
-        </w:rPr>
-        <w:t xml:space="preserve">AI-Augmented Systems Engineering: </w:t>
-      </w:r>
-      <w:r>
-        <w:t>Pioneered AI-assisted and agentic development workflows (GitHub Copilot, Claude Code, Google Antigravity, declarative CLAUDE.md / AGENTS.md context guardrails, and automated diagnostic tooling) to translate system architecture into verified C/C++, Python, and TypeScript implementations while accelerating protocol debugging and cross-OS refactoring.</w:t>
-      </w:r>
-    </w:p>
-    <w:p>
-      <w:pPr>
-        <w:pStyle w:val="ListBullet"/>
-        <w:spacing w:after="40"/>
-      </w:pPr>
-      <w:r>
-        <w:rPr>
-          <w:b/>
-        </w:rPr>
-        <w:t xml:space="preserve">Fleet OS Modernization &amp; Runtime Optimization: </w:t>
-      </w:r>
-      <w:r>
-        <w:t>Ported and compiled core C/C++ edge software to support remote in-field Embedded Linux LTS distribution upgrades, while replacing heavy containerized edge runtimes with lightweight native cloud SDK daemons (cutting deployment footprint by ~50%).</w:t>
-      </w:r>
-    </w:p>
-    <w:p>
-      <w:pPr>
-        <w:tabs>
-          <w:tab w:pos="10800" w:val="right"/>
-        </w:tabs>
-        <w:spacing w:before="140" w:after="40"/>
-      </w:pPr>
-      <w:r>
-        <w:rPr>
-          <w:b/>
-          <w:i/>
-          <w:color w:val="334155"/>
-        </w:rPr>
-        <w:t>Associate Digital Innovation Engineer</w:t>
-      </w:r>
-      <w:r>
-        <w:rPr>
-          <w:b/>
-          <w:color w:val="64748B"/>
-          <w:sz w:val="19"/>
-        </w:rPr>
-        <w:tab/>
-        <w:t>June 2019 – March 2022</w:t>
-      </w:r>
-    </w:p>
-    <w:p>
-      <w:pPr>
-        <w:pStyle w:val="ListBullet"/>
-        <w:spacing w:after="40"/>
-      </w:pPr>
-      <w:r>
-        <w:rPr>
-          <w:b/>
-        </w:rPr>
-        <w:t xml:space="preserve">Multi-Protocol Sensor &amp; Actuator Integration: </w:t>
-      </w:r>
-      <w:r>
-        <w:t>Developed production edge software and Python/Bash/C++ daemons to integrate multi-vendor industrial sensors, variable-rate dosing pumps, and PLCs across OPC UA, Modbus (TCP/IP &amp; RTU), LoRa, and analog/digital I/O networks, routing real-time telemetry to Azure IoT via MQTT.</w:t>
-      </w:r>
-    </w:p>
-    <w:p>
-      <w:pPr>
-        <w:pStyle w:val="ListBullet"/>
-        <w:spacing w:after="40"/>
-      </w:pPr>
-      <w:r>
-        <w:rPr>
-          <w:b/>
-        </w:rPr>
-        <w:t xml:space="preserve">Industrial Edge Networking, Cellular &amp; LoRa Backhaul: </w:t>
-      </w:r>
-      <w:r>
-        <w:t>Designed and configured multi-device field networks across dedicated cellular and LoRa gateways (Cradlepoint, Teltonika, MultiTech, Milesight) as well as onboard embedded cellular modems and Wi-Fi interfaces on headless Linux SBCs—configuring DHCP servers, NAT / port-forwarding rules, and automated Linux provisioning scripts to streamline global hardware bring-up and remote diagnostics.</w:t>
-      </w:r>
-    </w:p>
-    <w:p>
-      <w:pPr>
-        <w:tabs>
-          <w:tab w:pos="10800" w:val="right"/>
-        </w:tabs>
-        <w:spacing w:before="140" w:after="40"/>
-      </w:pPr>
-      <w:r>
-        <w:rPr>
-          <w:b/>
-          <w:i/>
-          <w:color w:val="334155"/>
-        </w:rPr>
-        <w:t>Regulatory Specialist (Automation &amp; Data Engineering)</w:t>
-      </w:r>
-      <w:r>
-        <w:rPr>
-          <w:b/>
-          <w:color w:val="64748B"/>
-          <w:sz w:val="19"/>
-        </w:rPr>
-        <w:tab/>
-        <w:t>September 2016 – May 2019</w:t>
-      </w:r>
-    </w:p>
-    <w:p>
-      <w:pPr>
-        <w:pStyle w:val="ListBullet"/>
-        <w:spacing w:after="40"/>
-      </w:pPr>
-      <w:r>
-        <w:rPr>
-          <w:b/>
-        </w:rPr>
-        <w:t xml:space="preserve">Compliance Automation Pipeline: </w:t>
-      </w:r>
-      <w:r>
-        <w:t>Designed and deployed an automated Python and XML data aggregation pipeline to compile, validate, and submit federal EPA Pesticide Production Reports, saving hundreds of engineering hours annually.</w:t>
-      </w:r>
-    </w:p>
-    <w:p>
-      <w:pPr>
-        <w:pStyle w:val="ListBullet"/>
-        <w:spacing w:after="40"/>
-      </w:pPr>
-      <w:r>
-        <w:rPr>
-          <w:b/>
-        </w:rPr>
-        <w:t xml:space="preserve">Automated Document Verification: </w:t>
-      </w:r>
-      <w:r>
-        <w:t>Engineered custom Python parsing and diffing tooling to audit EPA-registered labels, eliminating manual review bottlenecks and mitigating regulatory compliance risk.</w:t>
-      </w:r>
-    </w:p>
-    <w:p>
-      <w:pPr>
-        <w:tabs>
-          <w:tab w:pos="10800" w:val="right"/>
-        </w:tabs>
-        <w:spacing w:before="140" w:after="40"/>
-      </w:pPr>
-      <w:r>
-        <w:rPr>
-          <w:b/>
-          <w:i/>
-          <w:color w:val="334155"/>
-        </w:rPr>
-        <w:t>Technical Services Chemist &amp; Product Development Intern</w:t>
-      </w:r>
-      <w:r>
-        <w:rPr>
-          <w:b/>
-          <w:color w:val="64748B"/>
-          <w:sz w:val="19"/>
-        </w:rPr>
-        <w:tab/>
-        <w:t>September 2014 – September 2016</w:t>
-      </w:r>
-    </w:p>
-    <w:p>
-      <w:pPr>
-        <w:pStyle w:val="ListBullet"/>
-        <w:spacing w:after="40"/>
-      </w:pPr>
-      <w:r>
-        <w:rPr>
-          <w:b/>
-        </w:rPr>
-        <w:t xml:space="preserve">Laboratory &amp; Computer Vision Automation: </w:t>
-      </w:r>
-      <w:r>
-        <w:t>Self-initiated and deployed standalone Python (Tkinter) desktop applications and Java (ImageJ) computer-vision scripts to automate sample area/oil-level analysis and data entry, returning hundreds of laboratory hours per month to the chemistry team.</w:t>
-      </w:r>
-    </w:p>
-    <w:p>
-      <w:pPr>
-        <w:pBdr>
-          <w:bottom w:val="single" w:sz="12" w:space="1" w:color="CBD5E1"/>
-        </w:pBdr>
-        <w:spacing w:before="220" w:after="70"/>
-      </w:pPr>
-      <w:r>
-        <w:rPr>
-          <w:b/>
-          <w:color w:val="1A2A3A"/>
-          <w:sz w:val="22"/>
-        </w:rPr>
-        <w:t>ENGINEERING LAB &amp; SELECTED PROJECTS</w:t>
-      </w:r>
-    </w:p>
-    <w:p>
-      <w:pPr>
-        <w:pStyle w:val="ListBullet"/>
-        <w:spacing w:after="40"/>
-      </w:pPr>
-      <w:r>
-        <w:rPr>
-          <w:b/>
-        </w:rPr>
-        <w:t xml:space="preserve">AI-Augmented Engineering Portfolio &amp; Systems Lab (bernalgorithm.github.io): </w:t>
-      </w:r>
-      <w:r>
-        <w:t>Architected and deployed a statically exported Next.js and TypeScript technical portfolio and lab notebook using Google Antigravity and Gemini, enforcing declarative AGENTS.md context boundaries and automated GitHub Actions CI/CD pipelines.</w:t>
-      </w:r>
-    </w:p>
-    <w:p>
-      <w:pPr>
-        <w:pBdr>
-          <w:bottom w:val="single" w:sz="12" w:space="1" w:color="CBD5E1"/>
-        </w:pBdr>
-        <w:spacing w:before="220" w:after="70"/>
-      </w:pPr>
-      <w:r>
-        <w:rPr>
-          <w:b/>
-          <w:color w:val="1A2A3A"/>
-          <w:sz w:val="22"/>
-        </w:rPr>
-        <w:t>EDUCATION</w:t>
-      </w:r>
-    </w:p>
-    <w:p>
-      <w:pPr>
-        <w:tabs>
-          <w:tab w:pos="10800" w:val="right"/>
-        </w:tabs>
-        <w:spacing w:before="140" w:after="40"/>
-      </w:pPr>
-      <w:r>
-        <w:rPr>
-          <w:b/>
-          <w:i/>
-          <w:color w:val="334155"/>
-        </w:rPr>
-        <w:t>Oregon State University — B.S., Computer Science</w:t>
-      </w:r>
-      <w:r>
-        <w:rPr>
-          <w:b/>
-          <w:color w:val="64748B"/>
-          <w:sz w:val="19"/>
-        </w:rPr>
-        <w:tab/>
-        <w:t>2017 – 2019</w:t>
-      </w:r>
-    </w:p>
-    <w:p>
-      <w:pPr>
-        <w:pStyle w:val="ListBullet"/>
-        <w:spacing w:after="40"/>
-      </w:pPr>
-      <w:r>
-        <w:rPr>
-          <w:b/>
-        </w:rPr>
-        <w:t xml:space="preserve">Academic Focus: </w:t>
-      </w:r>
-      <w:r>
-        <w:t>Served as a university tutor and grader for Computer Science coursework, guiding students through object-oriented programming implementations and debugging in C++.</w:t>
-      </w:r>
-    </w:p>
-    <w:p>
-      <w:pPr>
-        <w:tabs>
-          <w:tab w:pos="10800" w:val="right"/>
-        </w:tabs>
-        <w:spacing w:before="140" w:after="40"/>
-      </w:pPr>
-      <w:r>
-        <w:rPr>
-          <w:b/>
-          <w:i/>
-          <w:color w:val="334155"/>
-        </w:rPr>
-        <w:t>University of Memphis — B.S., Chemistry (ACS Certified) &amp; B.S., Biology</w:t>
-      </w:r>
-      <w:r>
-        <w:rPr>
-          <w:b/>
-          <w:color w:val="64748B"/>
-          <w:sz w:val="19"/>
-        </w:rPr>
-        <w:tab/>
-        <w:t>2008 – 2014</w:t>
-      </w:r>
-    </w:p>
-    <w:p>
-      <w:pPr>
-        <w:pStyle w:val="ListBullet"/>
-        <w:spacing w:after="40"/>
-      </w:pPr>
-      <w:r>
-        <w:rPr>
-          <w:b/>
-        </w:rPr>
-        <w:t xml:space="preserve">NSF Computational Research: </w:t>
-      </w:r>
-      <w:r>
-        <w:t>Selected for National Science Foundation (NSF) computational chemistry funding; utilized high-performance Linux supercomputing clusters to model and analyze energetic profiles of metallo-organic molecules.</w:t>
-      </w:r>
-    </w:p>
-    <w:sectPr>
-      <w:pgSz w:w="12240" w:h="15840"/>
-      <w:pgMar w:top="720" w:right="720" w:bottom="720" w:left="720" w:header="720" w:footer="720" w:gutter="0"/>
-      <w:cols w:space="720"/>
-      <w:docGrid w:linePitch="360"/>
-    </w:sectPr>
-  </w:body>
-</w:document>
+<ns0:document xmlns:ns0="http://schemas.openxmlformats.org/wordprocessingml/2006/main" xmlns:ns1="http://schemas.openxmlformats.org/markup-compatibility/2006" ns1:Ignorable="w14 wp14">
+  <ns0:body>
+    <ns0:tbl>
+      <ns0:tblPr>
+        <ns0:tblW ns0:type="auto" ns0:w="0"/>
+        <ns0:jc ns0:val="center"/>
+        <ns0:tblLayout ns0:type="fixed"/>
+        <ns0:tblLook ns0:firstColumn="1" ns0:firstRow="1" ns0:lastColumn="0" ns0:lastRow="0" ns0:noHBand="0" ns0:noVBand="1" ns0:val="04A0"/>
+      </ns0:tblPr>
+      <ns0:tblGrid>
+        <ns0:gridCol ns0:w="10800"/>
+      </ns0:tblGrid>
+      <ns0:tr>
+        <ns0:tc>
+          <ns0:tcPr>
+            <ns0:tcW ns0:type="dxa" ns0:w="10800"/>
+            <ns0:shd ns0:val="clear" ns0:color="auto" ns0:fill="1A2A3A"/>
+          </ns0:tcPr>
+          <ns0:p>
+            <ns0:pPr>
+              <ns0:spacing ns0:before="200"/>
+              <ns0:jc ns0:val="center"/>
+            </ns0:pPr>
+            <ns0:r>
+              <ns0:rPr>
+                <ns0:b/>
+                <ns0:color ns0:val="FFFFFF"/>
+                <ns0:sz ns0:val="44"/>
+              </ns0:rPr>
+              <ns0:t>ALEXANDER BERNAL</ns0:t>
+            </ns0:r>
+          </ns0:p>
+          <ns0:p>
+            <ns0:pPr>
+              <ns0:spacing ns0:after="200"/>
+              <ns0:jc ns0:val="center"/>
+            </ns0:pPr>
+            <ns0:r>
+              <ns0:rPr>
+                <ns0:color ns0:val="B0C4DE"/>
+                <ns0:sz ns0:val="18"/>
+              </ns0:rPr>
+              <ns0:t>901-220-1510  |  me@alexanderbernal.dev  |  linkedin.com/in/bernaale  |  github.com/bernalgorithm  |  Memphis, TN</ns0:t>
+            </ns0:r>
+          </ns0:p>
+        </ns0:tc>
+      </ns0:tr>
+    </ns0:tbl>
+    <ns0:p>
+      <ns0:pPr>
+        <ns0:pBdr>
+          <ns0:bottom ns0:val="single" ns0:sz="12" ns0:space="1" ns0:color="CBD5E1"/>
+        </ns0:pBdr>
+        <ns0:spacing ns0:before="220" ns0:after="70"/>
+      </ns0:pPr>
+      <ns0:r>
+        <ns0:rPr>
+          <ns0:b/>
+          <ns0:color ns0:val="1A2A3A"/>
+          <ns0:sz ns0:val="22"/>
+        </ns0:rPr>
+        <ns0:t>PROFESSIONAL SUMMARY</ns0:t>
+      </ns0:r>
+    </ns0:p>
+    <ns0:p>
+      <ns0:pPr>
+        <ns0:spacing ns0:after="140"/>
+      </ns0:pPr>
+      <ns0:r>
+        <ns0:t>Senior Embedded Systems, IoT &amp; Full-Stack Software Engineer with 7+ years of experience designing and shipping production software that connects physical hardware to the cloud—backed by 12 years of total engineering, automation, and R&amp;D tenure. Proven track record leading end-to-end architecture for Linux-based edge devices, automated sensor-to-actuator control systems, and full-stack web platforms deployed across 20+ countries on 6 continents. Known for building self-healing software that keeps mission-critical field equipment running reliably over unstable networks, and for combining C/C++, Python, and TypeScript with modern AI-assisted development workflows to deliver high-reliability systems fast.</ns0:t>
+      </ns0:r>
+    </ns0:p>
+    <ns0:p>
+      <ns0:pPr>
+        <ns0:pBdr>
+          <ns0:bottom ns0:val="single" ns0:sz="12" ns0:space="1" ns0:color="CBD5E1"/>
+        </ns0:pBdr>
+        <ns0:spacing ns0:before="220" ns0:after="70"/>
+      </ns0:pPr>
+      <ns0:r>
+        <ns0:rPr>
+          <ns0:b/>
+          <ns0:color ns0:val="1A2A3A"/>
+          <ns0:sz ns0:val="22"/>
+        </ns0:rPr>
+        <ns0:t>TECHNICAL SKILLS</ns0:t>
+      </ns0:r>
+    </ns0:p>
+    <ns0:tbl>
+      <ns0:tblPr>
+        <ns0:tblW ns0:type="auto" ns0:w="0"/>
+        <ns0:tblLook ns0:firstColumn="1" ns0:firstRow="1" ns0:lastColumn="0" ns0:lastRow="0" ns0:noHBand="0" ns0:noVBand="1" ns0:val="04A0"/>
+      </ns0:tblPr>
+      <ns0:tblGrid>
+        <ns0:gridCol ns0:w="3000"/>
+        <ns0:gridCol ns0:w="7800"/>
+      </ns0:tblGrid>
+      <ns0:tr>
+        <ns0:tc>
+          <ns0:tcPr>
+            <ns0:tcW ns0:type="dxa" ns0:w="3000"/>
+            <ns0:tcBorders>
+              <ns0:top ns0:val="nil"/>
+              <ns0:left ns0:val="nil"/>
+              <ns0:bottom ns0:val="nil"/>
+              <ns0:right ns0:val="nil"/>
+            </ns0:tcBorders>
+          </ns0:tcPr>
+          <ns0:p>
+            <ns0:pPr>
+              <ns0:spacing ns0:after="40"/>
+            </ns0:pPr>
+            <ns0:r>
+              <ns0:rPr>
+                <ns0:b/>
+                <ns0:color ns0:val="1E293B"/>
+              </ns0:rPr>
+              <ns0:t>Languages &amp; Frameworks</ns0:t>
+            </ns0:r>
+          </ns0:p>
+        </ns0:tc>
+        <ns0:tc>
+          <ns0:tcPr>
+            <ns0:tcW ns0:type="dxa" ns0:w="7800"/>
+            <ns0:tcBorders>
+              <ns0:top ns0:val="nil"/>
+              <ns0:left ns0:val="nil"/>
+              <ns0:bottom ns0:val="nil"/>
+              <ns0:right ns0:val="nil"/>
+            </ns0:tcBorders>
+          </ns0:tcPr>
+          <ns0:p>
+            <ns0:pPr>
+              <ns0:spacing ns0:after="40"/>
+            </ns0:pPr>
+            <ns0:r>
+              <ns0:t>Python, C, C++, TypeScript, JavaScript, Bash, SQL, React, Next.js, Tailwind CSS</ns0:t>
+            </ns0:r>
+          </ns0:p>
+        </ns0:tc>
+      </ns0:tr>
+      <ns0:tr>
+        <ns0:tc>
+          <ns0:tcPr>
+            <ns0:tcW ns0:type="dxa" ns0:w="3000"/>
+            <ns0:tcBorders>
+              <ns0:top ns0:val="nil"/>
+              <ns0:left ns0:val="nil"/>
+              <ns0:bottom ns0:val="nil"/>
+              <ns0:right ns0:val="nil"/>
+            </ns0:tcBorders>
+          </ns0:tcPr>
+          <ns0:p>
+            <ns0:pPr>
+              <ns0:spacing ns0:after="40"/>
+            </ns0:pPr>
+            <ns0:r>
+              <ns0:rPr>
+                <ns0:b/>
+                <ns0:color ns0:val="1E293B"/>
+              </ns0:rPr>
+              <ns0:t>Embedded Linux, IoT &amp; Edge Infrastructure</ns0:t>
+            </ns0:r>
+          </ns0:p>
+        </ns0:tc>
+        <ns0:tc>
+          <ns0:tcPr>
+            <ns0:tcW ns0:type="dxa" ns0:w="7800"/>
+            <ns0:tcBorders>
+              <ns0:top ns0:val="nil"/>
+              <ns0:left ns0:val="nil"/>
+              <ns0:bottom ns0:val="nil"/>
+              <ns0:right ns0:val="nil"/>
+            </ns0:tcBorders>
+          </ns0:tcPr>
+          <ns0:p>
+            <ns0:pPr>
+              <ns0:spacing ns0:after="40"/>
+            </ns0:pPr>
+            <ns0:r>
+              <ns0:t>Embedded Linux (Ubuntu, background services/daemons), Azure IoT, Docker, Remote Over-the-Air (OTA) Fleet Upgrades, Headless Single-Board Computers (SBCs)</ns0:t>
+            </ns0:r>
+          </ns0:p>
+        </ns0:tc>
+      </ns0:tr>
+      <ns0:tr>
+        <ns0:tc>
+          <ns0:tcPr>
+            <ns0:tcW ns0:type="dxa" ns0:w="3000"/>
+            <ns0:tcBorders>
+              <ns0:top ns0:val="nil"/>
+              <ns0:left ns0:val="nil"/>
+              <ns0:bottom ns0:val="nil"/>
+              <ns0:right ns0:val="nil"/>
+            </ns0:tcBorders>
+          </ns0:tcPr>
+          <ns0:p>
+            <ns0:pPr>
+              <ns0:spacing ns0:after="40"/>
+            </ns0:pPr>
+            <ns0:r>
+              <ns0:rPr>
+                <ns0:b/>
+                <ns0:color ns0:val="1E293B"/>
+              </ns0:rPr>
+              <ns0:t>Field Networking &amp; Connectivity</ns0:t>
+            </ns0:r>
+          </ns0:p>
+        </ns0:tc>
+        <ns0:tc>
+          <ns0:tcPr>
+            <ns0:tcW ns0:type="dxa" ns0:w="7800"/>
+            <ns0:tcBorders>
+              <ns0:top ns0:val="nil"/>
+              <ns0:left ns0:val="nil"/>
+              <ns0:bottom ns0:val="nil"/>
+              <ns0:right ns0:val="nil"/>
+            </ns0:tcBorders>
+          </ns0:tcPr>
+          <ns0:p>
+            <ns0:pPr>
+              <ns0:spacing ns0:after="40"/>
+            </ns0:pPr>
+            <ns0:r>
+              <ns0:t>Cellular &amp; LoRaWAN Gateways (Cradlepoint, Teltonika, MultiTech, Milesight), Embedded Modems &amp; Wi-Fi, TCP/IP, DHCP, NAT / Port Forwarding, Subnet Routing</ns0:t>
+            </ns0:r>
+          </ns0:p>
+        </ns0:tc>
+      </ns0:tr>
+      <ns0:tr>
+        <ns0:tc>
+          <ns0:tcPr>
+            <ns0:tcW ns0:type="dxa" ns0:w="3000"/>
+            <ns0:tcBorders>
+              <ns0:top ns0:val="nil"/>
+              <ns0:left ns0:val="nil"/>
+              <ns0:bottom ns0:val="nil"/>
+              <ns0:right ns0:val="nil"/>
+            </ns0:tcBorders>
+          </ns0:tcPr>
+          <ns0:p>
+            <ns0:pPr>
+              <ns0:spacing ns0:after="40"/>
+            </ns0:pPr>
+            <ns0:r>
+              <ns0:rPr>
+                <ns0:b/>
+                <ns0:color ns0:val="1E293B"/>
+              </ns0:rPr>
+              <ns0:t>Hardware Integration &amp; Control Protocols</ns0:t>
+            </ns0:r>
+          </ns0:p>
+        </ns0:tc>
+        <ns0:tc>
+          <ns0:tcPr>
+            <ns0:tcW ns0:type="dxa" ns0:w="7800"/>
+            <ns0:tcBorders>
+              <ns0:top ns0:val="nil"/>
+              <ns0:left ns0:val="nil"/>
+              <ns0:bottom ns0:val="nil"/>
+              <ns0:right ns0:val="nil"/>
+            </ns0:tcBorders>
+          </ns0:tcPr>
+          <ns0:p>
+            <ns0:pPr>
+              <ns0:spacing ns0:after="40"/>
+            </ns0:pPr>
+            <ns0:r>
+              <ns0:t>Automated Closed-Loop Control (PID), Modbus (TCP/IP &amp; RTU), OPC UA, MQTT, 4–20mA Analog &amp; Digital I/O, PLCs, Multi-Vendor Sensor &amp; Pump/Actuator Integration</ns0:t>
+            </ns0:r>
+          </ns0:p>
+        </ns0:tc>
+      </ns0:tr>
+      <ns0:tr>
+        <ns0:tc>
+          <ns0:tcPr>
+            <ns0:tcW ns0:type="dxa" ns0:w="3000"/>
+            <ns0:tcBorders>
+              <ns0:top ns0:val="nil"/>
+              <ns0:left ns0:val="nil"/>
+              <ns0:bottom ns0:val="nil"/>
+              <ns0:right ns0:val="nil"/>
+            </ns0:tcBorders>
+          </ns0:tcPr>
+          <ns0:p>
+            <ns0:pPr>
+              <ns0:spacing ns0:after="40"/>
+            </ns0:pPr>
+            <ns0:r>
+              <ns0:rPr>
+                <ns0:b/>
+                <ns0:color ns0:val="1E293B"/>
+              </ns0:rPr>
+              <ns0:t>Cloud, Full-Stack &amp; Engineering Workflow</ns0:t>
+            </ns0:r>
+          </ns0:p>
+        </ns0:tc>
+        <ns0:tc>
+          <ns0:tcPr>
+            <ns0:tcW ns0:type="dxa" ns0:w="7800"/>
+            <ns0:tcBorders>
+              <ns0:top ns0:val="nil"/>
+              <ns0:left ns0:val="nil"/>
+              <ns0:bottom ns0:val="nil"/>
+              <ns0:right ns0:val="nil"/>
+            </ns0:tcBorders>
+          </ns0:tcPr>
+          <ns0:p>
+            <ns0:pPr>
+              <ns0:spacing ns0:after="40"/>
+            </ns0:pPr>
+            <ns0:r>
+              <ns0:t>Rule-Based Configuration &amp; Decision Engines, Firebase / Firestore, GitHub Actions (CI/CD), Azure DevOps, Git, AI-Augmented Development (Claude Code, GitHub Copilot, Gemini)</ns0:t>
+            </ns0:r>
+          </ns0:p>
+        </ns0:tc>
+      </ns0:tr>
+    </ns0:tbl>
+    <ns0:p>
+      <ns0:pPr>
+        <ns0:pBdr>
+          <ns0:bottom ns0:val="single" ns0:sz="12" ns0:space="1" ns0:color="CBD5E1"/>
+        </ns0:pBdr>
+        <ns0:spacing ns0:before="220" ns0:after="70"/>
+      </ns0:pPr>
+      <ns0:r>
+        <ns0:rPr>
+          <ns0:b/>
+          <ns0:color ns0:val="1A2A3A"/>
+          <ns0:sz ns0:val="22"/>
+        </ns0:rPr>
+        <ns0:t>PROFESSIONAL EXPERIENCE</ns0:t>
+      </ns0:r>
+    </ns0:p>
+    <ns0:p>
+      <ns0:pPr>
+        <ns0:tabs>
+          <ns0:tab ns0:pos="10800" ns0:val="right"/>
+        </ns0:tabs>
+        <ns0:spacing ns0:before="140" ns0:after="40"/>
+      </ns0:pPr>
+      <ns0:r>
+        <ns0:rPr>
+          <ns0:b/>
+          <ns0:color ns0:val="0F172A"/>
+          <ns0:sz ns0:val="22"/>
+        </ns0:rPr>
+        <ns0:t xml:space="preserve">Buckman – </ns0:t>
+      </ns0:r>
+      <ns0:r>
+        <ns0:rPr>
+          <ns0:b/>
+          <ns0:i/>
+          <ns0:color ns0:val="334155"/>
+        </ns0:rPr>
+        <ns0:t>Digital Innovation Engineer (Senior Embedded, IoT &amp; Full-Stack)</ns0:t>
+      </ns0:r>
+      <ns0:r>
+        <ns0:rPr>
+          <ns0:b/>
+          <ns0:color ns0:val="64748B"/>
+          <ns0:sz ns0:val="19"/>
+        </ns0:rPr>
+        <ns0:tab/>
+        <ns0:t>March 2022 – Present</ns0:t>
+      </ns0:r>
+    </ns0:p>
+    <ns0:p>
+      <ns0:pPr>
+        <ns0:pStyle ns0:val="ListBullet"/>
+        <ns0:spacing ns0:after="40"/>
+      </ns0:pPr>
+      <ns0:r>
+        <ns0:rPr>
+          <ns0:b/>
+        </ns0:rPr>
+        <ns0:t xml:space="preserve">Global IoT &amp; Automated Control Architecture: </ns0:t>
+      </ns0:r>
+      <ns0:r>
+        <ns0:t>Lead end-to-end software architecture, Embedded Linux development, and network integration for automated industrial control systems—taking products from initial prototype to commercial deployment across 20+ countries on 6 continents.</ns0:t>
+      </ns0:r>
+    </ns0:p>
+    <ns0:p>
+      <ns0:pPr>
+        <ns0:pStyle ns0:val="ListBullet"/>
+        <ns0:spacing ns0:after="40"/>
+      </ns0:pPr>
+      <ns0:r>
+        <ns0:rPr>
+          <ns0:b/>
+        </ns0:rPr>
+        <ns0:t xml:space="preserve">Self-Healing Device Reliability (Zero-Downtime Operations): </ns0:t>
+      </ns0:r>
+      <ns0:r>
+        <ns0:t>Eliminated customer-visible downtime from third-party hardware freezes (which previously caused 20–40 minute outages) by engineering fault-tolerant communication state machines (Modbus TCP/RTU, OPC UA, MQTT) that automatically detect dropouts, quarantine bad sensor reads, and restore live device state upon reboot.</ns0:t>
+      </ns0:r>
+    </ns0:p>
+    <ns0:p>
+      <ns0:pPr>
+        <ns0:pStyle ns0:val="ListBullet"/>
+        <ns0:spacing ns0:after="40"/>
+      </ns0:pPr>
+      <ns0:r>
+        <ns0:rPr>
+          <ns0:b/>
+        </ns0:rPr>
+        <ns0:t xml:space="preserve">Lightweight Edge Modernization (~50% Resource Reduction): </ns0:t>
+      </ns0:r>
+      <ns0:r>
+        <ns0:t>Cut edge device memory and storage usage by ~50% by replacing heavy Docker container runtimes with lightweight native C/C++ cloud services, and ported core software to support remote Embedded Linux OS upgrades across live field fleets without requiring on-site technician visits.</ns0:t>
+      </ns0:r>
+    </ns0:p>
+    <ns0:p>
+      <ns0:pPr>
+        <ns0:pStyle ns0:val="ListBullet"/>
+        <ns0:spacing ns0:after="40"/>
+      </ns0:pPr>
+      <ns0:r>
+        <ns0:rPr>
+          <ns0:b/>
+        </ns0:rPr>
+        <ns0:t xml:space="preserve">Global Product Configuration Platform: </ns0:t>
+      </ns0:r>
+      <ns0:r>
+        <ns0:t>Architected a web-based configuration and recommendation platform that translates complex engineering sizing rules from senior specialists into an automated, step-by-step tool—standardizing commercial system proposals worldwide and reducing manual configuration errors.</ns0:t>
+      </ns0:r>
+    </ns0:p>
+    <ns0:p>
+      <ns0:pPr>
+        <ns0:pStyle ns0:val="ListBullet"/>
+        <ns0:spacing ns0:after="40"/>
+      </ns0:pPr>
+      <ns0:r>
+        <ns0:rPr>
+          <ns0:b/>
+        </ns0:rPr>
+        <ns0:t xml:space="preserve">AI-Accelerated Software Delivery: </ns0:t>
+      </ns0:r>
+      <ns0:r>
+        <ns0:t>Established structured AI-assisted engineering workflows (Claude Code, GitHub Copilot, Gemini) paired with automated test verification and architectural guardrails to accelerate C/C++, Python, and TypeScript feature delivery, protocol debugging, and cross-platform refactoring.</ns0:t>
+      </ns0:r>
+    </ns0:p>
+    <ns0:p>
+      <ns0:pPr>
+        <ns0:tabs>
+          <ns0:tab ns0:pos="10800" ns0:val="right"/>
+        </ns0:tabs>
+        <ns0:spacing ns0:before="140" ns0:after="40"/>
+      </ns0:pPr>
+      <ns0:r>
+        <ns0:rPr>
+          <ns0:b/>
+          <ns0:i/>
+          <ns0:color ns0:val="334155"/>
+        </ns0:rPr>
+        <ns0:t>Associate Digital Innovation Engineer (Embedded Linux &amp; IoT Software)</ns0:t>
+      </ns0:r>
+      <ns0:r>
+        <ns0:rPr>
+          <ns0:b/>
+          <ns0:color ns0:val="64748B"/>
+          <ns0:sz ns0:val="19"/>
+        </ns0:rPr>
+        <ns0:tab/>
+        <ns0:t>June 2019 – March 2022</ns0:t>
+      </ns0:r>
+    </ns0:p>
+    <ns0:p>
+      <ns0:pPr>
+        <ns0:pStyle ns0:val="ListBullet"/>
+        <ns0:spacing ns0:after="40"/>
+      </ns0:pPr>
+      <ns0:r>
+        <ns0:rPr>
+          <ns0:b/>
+        </ns0:rPr>
+        <ns0:t xml:space="preserve">Hardware-to-Cloud Telemetry Integration: </ns0:t>
+      </ns0:r>
+      <ns0:r>
+        <ns0:t>Developed production Python, C++, and Bash background services on Linux edge devices to connect multi-vendor sensors, variable-rate pumps/actuators, and PLCs (OPC UA, Modbus, LoRa, Analog/Digital I/O), streaming real-time operational data to Azure IoT via MQTT.</ns0:t>
+      </ns0:r>
+    </ns0:p>
+    <ns0:p>
+      <ns0:pPr>
+        <ns0:pStyle ns0:val="ListBullet"/>
+        <ns0:spacing ns0:after="40"/>
+      </ns0:pPr>
+      <ns0:r>
+        <ns0:rPr>
+          <ns0:b/>
+        </ns0:rPr>
+        <ns0:t xml:space="preserve">Field Network Architecture &amp; Automated Provisioning: </ns0:t>
+      </ns0:r>
+      <ns0:r>
+        <ns0:t>Designed secure local and cellular/LoRa field networks across industrial routers (Cradlepoint, Teltonika, MultiTech, Milesight) and headless Linux devices—configuring DHCP, NAT/port forwarding, and automated provisioning scripts to cut hardware setup time and enable remote diagnostics in hard-to-reach facilities.</ns0:t>
+      </ns0:r>
+    </ns0:p>
+    <ns0:p>
+      <ns0:pPr>
+        <ns0:tabs>
+          <ns0:tab ns0:pos="10800" ns0:val="right"/>
+        </ns0:tabs>
+        <ns0:spacing ns0:before="140" ns0:after="40"/>
+      </ns0:pPr>
+      <ns0:r>
+        <ns0:rPr>
+          <ns0:b/>
+          <ns0:i/>
+          <ns0:color ns0:val="334155"/>
+        </ns0:rPr>
+        <ns0:t>Regulatory Specialist (Automation &amp; Data Engineering)</ns0:t>
+      </ns0:r>
+      <ns0:r>
+        <ns0:rPr>
+          <ns0:b/>
+          <ns0:color ns0:val="64748B"/>
+          <ns0:sz ns0:val="19"/>
+        </ns0:rPr>
+        <ns0:tab/>
+        <ns0:t>September 2016 – May 2019</ns0:t>
+      </ns0:r>
+    </ns0:p>
+    <ns0:p>
+      <ns0:pPr>
+        <ns0:pStyle ns0:val="ListBullet"/>
+        <ns0:spacing ns0:after="40"/>
+      </ns0:pPr>
+      <ns0:r>
+        <ns0:rPr>
+          <ns0:b/>
+        </ns0:rPr>
+        <ns0:t xml:space="preserve">Federal Reporting Automation: </ns0:t>
+      </ns0:r>
+      <ns0:r>
+        <ns0:t>Designed and deployed an automated Python and XML data pipeline to aggregate, validate, and generate federal EPA production reports—saving hundreds of engineering hours annually and eliminating manual spreadsheet errors.</ns0:t>
+      </ns0:r>
+    </ns0:p>
+    <ns0:p>
+      <ns0:pPr>
+        <ns0:pStyle ns0:val="ListBullet"/>
+        <ns0:spacing ns0:after="40"/>
+      </ns0:pPr>
+      <ns0:r>
+        <ns0:rPr>
+          <ns0:b/>
+        </ns0:rPr>
+        <ns0:t xml:space="preserve">Automated Compliance Auditing: </ns0:t>
+      </ns0:r>
+      <ns0:r>
+        <ns0:t>Built custom Python document-parsing and diffing tools to audit registered product labels against regulatory standards, removing manual review bottlenecks while reducing compliance risk.</ns0:t>
+      </ns0:r>
+    </ns0:p>
+    <ns0:p>
+      <ns0:pPr>
+        <ns0:tabs>
+          <ns0:tab ns0:pos="10800" ns0:val="right"/>
+        </ns0:tabs>
+        <ns0:spacing ns0:before="140" ns0:after="40"/>
+      </ns0:pPr>
+      <ns0:r>
+        <ns0:rPr>
+          <ns0:b/>
+          <ns0:i/>
+          <ns0:color ns0:val="334155"/>
+        </ns0:rPr>
+        <ns0:t>Technical Services Chemist &amp; Product Development Intern</ns0:t>
+      </ns0:r>
+      <ns0:r>
+        <ns0:rPr>
+          <ns0:b/>
+          <ns0:color ns0:val="64748B"/>
+          <ns0:sz ns0:val="19"/>
+        </ns0:rPr>
+        <ns0:tab/>
+        <ns0:t>September 2014 – September 2016</ns0:t>
+      </ns0:r>
+    </ns0:p>
+    <ns0:p>
+      <ns0:pPr>
+        <ns0:pStyle ns0:val="ListBullet"/>
+        <ns0:spacing ns0:after="40"/>
+      </ns0:pPr>
+      <ns0:r>
+        <ns0:rPr>
+          <ns0:b/>
+        </ns0:rPr>
+        <ns0:t xml:space="preserve">Lab Software &amp; Computer Vision Automation: </ns0:t>
+      </ns0:r>
+      <ns0:r>
+        <ns0:t>Self-initiated and built standalone Python (Tkinter) desktop apps and Java (ImageJ) computer-vision scripts to automate image-based sample analysis and data entry—returning hundreds of hours per month to the R&amp;D team and sparking transition into full-time software engineering.</ns0:t>
+      </ns0:r>
+    </ns0:p>
+    <ns0:p>
+      <ns0:pPr>
+        <ns0:pBdr>
+          <ns0:bottom ns0:val="single" ns0:sz="12" ns0:space="1" ns0:color="CBD5E1"/>
+        </ns0:pBdr>
+        <ns0:spacing ns0:before="220" ns0:after="70"/>
+      </ns0:pPr>
+      <ns0:r>
+        <ns0:rPr>
+          <ns0:b/>
+          <ns0:color ns0:val="1A2A3A"/>
+          <ns0:sz ns0:val="22"/>
+        </ns0:rPr>
+        <ns0:t>SELECTED SOFTWARE &amp; ENGINEERING PROJECTS</ns0:t>
+      </ns0:r>
+    </ns0:p>
+    <ns0:p>
+      <ns0:pPr>
+        <ns0:pStyle ns0:val="ListBullet"/>
+        <ns0:spacing ns0:after="40"/>
+      </ns0:pPr>
+      <ns0:r>
+        <ns0:rPr>
+          <ns0:b/>
+        </ns0:rPr>
+        <ns0:t xml:space="preserve">Interactive Control Systems &amp; Robotics Simulators (bernalgorithm.github.io/bernalgorithm): </ns0:t>
+      </ns0:r>
+      <ns0:r>
+        <ns0:t>Built a Next.js / TypeScript engineering portfolio featuring real-time 60 FPS browser simulations—including a 3D 4-DOF Robotic Arm Inverse Kinematics Planner and a Closed-Loop PID Process Control Lab with interactive disturbance testing and digital oscilloscope telemetry—plus technical case studies on fault-tolerant IoT architecture and offline-first cloud sync.</ns0:t>
+      </ns0:r>
+    </ns0:p>
+    <ns0:p>
+      <ns0:pPr>
+        <ns0:pBdr>
+          <ns0:bottom ns0:val="single" ns0:sz="12" ns0:space="1" ns0:color="CBD5E1"/>
+        </ns0:pBdr>
+        <ns0:spacing ns0:before="220" ns0:after="70"/>
+      </ns0:pPr>
+      <ns0:r>
+        <ns0:rPr>
+          <ns0:b/>
+          <ns0:color ns0:val="1A2A3A"/>
+          <ns0:sz ns0:val="22"/>
+        </ns0:rPr>
+        <ns0:t>EDUCATION</ns0:t>
+      </ns0:r>
+    </ns0:p>
+    <ns0:p>
+      <ns0:pPr>
+        <ns0:tabs>
+          <ns0:tab ns0:pos="10800" ns0:val="right"/>
+        </ns0:tabs>
+        <ns0:spacing ns0:before="140" ns0:after="40"/>
+      </ns0:pPr>
+      <ns0:r>
+        <ns0:rPr>
+          <ns0:b/>
+          <ns0:i/>
+          <ns0:color ns0:val="334155"/>
+        </ns0:rPr>
+        <ns0:t>Oregon State University — B.S., Computer Science</ns0:t>
+      </ns0:r>
+      <ns0:r>
+        <ns0:rPr>
+          <ns0:b/>
+          <ns0:color ns0:val="64748B"/>
+          <ns0:sz ns0:val="19"/>
+        </ns0:rPr>
+        <ns0:tab/>
+        <ns0:t>2017 – 2019</ns0:t>
+      </ns0:r>
+    </ns0:p>
+    <ns0:p>
+      <ns0:pPr>
+        <ns0:pStyle ns0:val="ListBullet"/>
+        <ns0:spacing ns0:after="40"/>
+      </ns0:pPr>
+      <ns0:r>
+        <ns0:rPr>
+          <ns0:b/>
+        </ns0:rPr>
+        <ns0:t xml:space="preserve">Academic Focus: </ns0:t>
+      </ns0:r>
+      <ns0:r>
+        <ns0:t>Completed degree while working full-time; served as a University Computer Science Tutor &amp; Grader, mentoring students in C++ object-oriented programming, data structures, and debugging.</ns0:t>
+      </ns0:r>
+    </ns0:p>
+    <ns0:p>
+      <ns0:pPr>
+        <ns0:tabs>
+          <ns0:tab ns0:pos="10800" ns0:val="right"/>
+        </ns0:tabs>
+        <ns0:spacing ns0:before="140" ns0:after="40"/>
+      </ns0:pPr>
+      <ns0:r>
+        <ns0:rPr>
+          <ns0:b/>
+          <ns0:i/>
+          <ns0:color ns0:val="334155"/>
+        </ns0:rPr>
+        <ns0:t>University of Memphis — B.S., Chemistry (ACS Certified) &amp; B.S., Biology</ns0:t>
+      </ns0:r>
+      <ns0:r>
+        <ns0:rPr>
+          <ns0:b/>
+          <ns0:color ns0:val="64748B"/>
+          <ns0:sz ns0:val="19"/>
+        </ns0:rPr>
+        <ns0:tab/>
+        <ns0:t>2008 – 2014</ns0:t>
+      </ns0:r>
+    </ns0:p>
+    <ns0:p>
+      <ns0:pPr>
+        <ns0:pStyle ns0:val="ListBullet"/>
+        <ns0:spacing ns0:after="40"/>
+      </ns0:pPr>
+      <ns0:r>
+        <ns0:rPr>
+          <ns0:b/>
+        </ns0:rPr>
+        <ns0:t xml:space="preserve">NSF Computational Research: </ns0:t>
+      </ns0:r>
+      <ns0:r>
+        <ns0:t>Awarded National Science Foundation (NSF) funding to model and analyze molecular energy profiles on high-performance Linux supercomputing clusters.</ns0:t>
+      </ns0:r>
+    </ns0:p>
+    <ns0:sectPr ns0:rsidR="00FC693F" ns0:rsidRPr="0006063C" ns0:rsidSect="00034616">
+      <ns0:pgSz ns0:w="12240" ns0:h="15840"/>
+      <ns0:pgMar ns0:top="720" ns0:right="720" ns0:bottom="720" ns0:left="720" ns0:header="720" ns0:footer="720" ns0:gutter="0"/>
+      <ns0:cols ns0:space="720"/>
+      <ns0:docGrid ns0:linePitch="360"/>
+    </ns0:sectPr>
+  </ns0:body>
+</ns0:document>
 </file>
 
 <file path=word/numbering.xml><?xml version="1.0" encoding="utf-8"?>

</xml_diff>

<commit_message>
Include Google Antigravity across resume summary, skills, and experience
</commit_message>
<xml_diff>
--- a/my-next-app/public/Alexander_Bernal_Resume.docx
+++ b/my-next-app/public/Alexander_Bernal_Resume.docx
@@ -69,7 +69,7 @@
         <ns0:spacing ns0:after="140"/>
       </ns0:pPr>
       <ns0:r>
-        <ns0:t>Senior Embedded Systems, IoT &amp; Full-Stack Software Engineer with 7+ years of experience designing and shipping production software that connects physical hardware to the cloud—backed by 12 years of total engineering, automation, and R&amp;D tenure. Proven track record leading end-to-end architecture for Linux-based edge devices, automated sensor-to-actuator control systems, and full-stack web platforms deployed across 20+ countries on 6 continents. Known for building self-healing software that keeps mission-critical field equipment running reliably over unstable networks, and for combining C/C++, Python, and TypeScript with modern AI-assisted development workflows to deliver high-reliability systems fast.</ns0:t>
+        <ns0:t>Senior Embedded Systems, IoT &amp; Full-Stack Software Engineer with 7+ years of experience designing and shipping production software that connects physical hardware to the cloud—backed by 12 years of total engineering, automation, and R&amp;D tenure. Proven track record leading end-to-end architecture for Linux-based edge devices, automated sensor-to-actuator control systems, and full-stack web platforms deployed across 20+ countries on 6 continents. Known for building self-healing software that keeps mission-critical field equipment running reliably over unstable networks, and for combining C/C++, Python, and TypeScript with modern AI-assisted development workflows (Claude Code, Google Antigravity, GitHub Copilot, Gemini) to deliver high-reliability systems fast.</ns0:t>
       </ns0:r>
     </ns0:p>
     <ns0:p>
@@ -312,7 +312,7 @@
               <ns0:spacing ns0:after="40"/>
             </ns0:pPr>
             <ns0:r>
-              <ns0:t>Rule-Based Configuration &amp; Decision Engines, Firebase / Firestore, GitHub Actions (CI/CD), Azure DevOps, Git, AI-Augmented Development (Claude Code, GitHub Copilot, Gemini)</ns0:t>
+              <ns0:t>Rule-Based Configuration &amp; Decision Engines, Firebase / Firestore, GitHub Actions (CI/CD), Azure DevOps, Git, AI-Augmented Development (Claude Code, Google Antigravity, GitHub Copilot, Gemini)</ns0:t>
             </ns0:r>
           </ns0:p>
         </ns0:tc>
@@ -439,7 +439,7 @@
         <ns0:t xml:space="preserve">AI-Accelerated Software Delivery: </ns0:t>
       </ns0:r>
       <ns0:r>
-        <ns0:t>Established structured AI-assisted engineering workflows (Claude Code, GitHub Copilot, Gemini) paired with automated test verification and architectural guardrails to accelerate C/C++, Python, and TypeScript feature delivery, protocol debugging, and cross-platform refactoring.</ns0:t>
+        <ns0:t>Established structured AI-assisted and agentic engineering workflows (Claude Code, Google Antigravity, GitHub Copilot, Gemini) paired with automated test verification and architectural guardrails to accelerate C/C++, Python, and TypeScript feature delivery, protocol debugging, and cross-platform refactoring.</ns0:t>
       </ns0:r>
     </ns0:p>
     <ns0:p>

</xml_diff>

<commit_message>
Highlight ICS/OT, network segmentation, operational resilience, and federal touchpoints on resume
</commit_message>
<xml_diff>
--- a/my-next-app/public/Alexander_Bernal_Resume.docx
+++ b/my-next-app/public/Alexander_Bernal_Resume.docx
@@ -69,7 +69,7 @@
         <ns0:spacing ns0:after="140"/>
       </ns0:pPr>
       <ns0:r>
-        <ns0:t>Senior Embedded Systems, IoT &amp; Full-Stack Software Engineer with 7+ years of experience designing and shipping production software that connects physical hardware to the cloud—backed by 12 years of total engineering, automation, and R&amp;D tenure. Proven track record leading end-to-end architecture for Linux-based edge devices, automated sensor-to-actuator control systems, and full-stack web platforms deployed across 20+ countries on 6 continents. Known for building self-healing software that keeps mission-critical field equipment running reliably over unstable networks, and for combining C/C++, Python, and TypeScript with modern AI-assisted development workflows (Claude Code, Google Antigravity, GitHub Copilot, Gemini) to deliver high-reliability systems fast.</ns0:t>
+        <ns0:t>Senior Embedded Systems, IoT &amp; Full-Stack Software Engineer with 7+ years of experience designing and shipping production software that connects physical hardware to the cloud—backed by 12 years of total engineering, automation, and R&amp;D tenure. Proven track record leading end-to-end architecture for Linux-based edge devices, Operational Technology (OT) / automated control systems, and full-stack web platforms deployed across 20+ countries on 6 continents. Known for building self-healing, resilient software that keeps mission-critical field equipment running reliably over unstable networks, and for combining C/C++, Python, and TypeScript with modern AI-assisted development workflows (Claude Code, Google Antigravity, GitHub Copilot, Gemini) to deliver high-reliability systems fast.</ns0:t>
       </ns0:r>
     </ns0:p>
     <ns0:p>
@@ -205,7 +205,7 @@
                 <ns0:b/>
                 <ns0:color ns0:val="1E293B"/>
               </ns0:rPr>
-              <ns0:t>Field Networking &amp; Connectivity</ns0:t>
+              <ns0:t>Field Networking, Segmentation &amp; Connectivity</ns0:t>
             </ns0:r>
           </ns0:p>
         </ns0:tc>
@@ -224,7 +224,7 @@
               <ns0:spacing ns0:after="40"/>
             </ns0:pPr>
             <ns0:r>
-              <ns0:t>Cellular &amp; LoRaWAN Gateways (Cradlepoint, Teltonika, MultiTech, Milesight), Embedded Modems &amp; Wi-Fi, TCP/IP, DHCP, NAT / Port Forwarding, Subnet Routing</ns0:t>
+              <ns0:t>Cellular &amp; LoRaWAN Gateways (Cradlepoint, Teltonika, MultiTech, Milesight), Embedded Modems &amp; Wi-Fi, TCP/IP, Subnet Routing &amp; Network Segmentation, DHCP, NAT / Port Forwarding</ns0:t>
             </ns0:r>
           </ns0:p>
         </ns0:tc>
@@ -249,7 +249,7 @@
                 <ns0:b/>
                 <ns0:color ns0:val="1E293B"/>
               </ns0:rPr>
-              <ns0:t>Hardware Integration &amp; Control Protocols</ns0:t>
+              <ns0:t>Industrial Control Systems (ICS/OT) &amp; Hardware Protocols</ns0:t>
             </ns0:r>
           </ns0:p>
         </ns0:tc>
@@ -376,10 +376,10 @@
         <ns0:rPr>
           <ns0:b/>
         </ns0:rPr>
-        <ns0:t xml:space="preserve">Global IoT &amp; Automated Control Architecture: </ns0:t>
+        <ns0:t xml:space="preserve">Global IoT, ICS/OT &amp; Automated Control Architecture: </ns0:t>
       </ns0:r>
       <ns0:r>
-        <ns0:t>Lead end-to-end software architecture, Embedded Linux development, and network integration for automated industrial control systems—taking products from initial prototype to commercial deployment across 20+ countries on 6 continents.</ns0:t>
+        <ns0:t>Lead end-to-end software architecture, Embedded Linux development, and network integration for automated industrial control systems across critical water treatment, chemical, and process manufacturing facilities—taking products from initial prototype to commercial deployment across 20+ countries on 6 continents.</ns0:t>
       </ns0:r>
     </ns0:p>
     <ns0:p>
@@ -391,10 +391,10 @@
         <ns0:rPr>
           <ns0:b/>
         </ns0:rPr>
-        <ns0:t xml:space="preserve">Self-Healing Device Reliability (Zero-Downtime Operations): </ns0:t>
+        <ns0:t xml:space="preserve">Self-Healing Device Reliability &amp; Operational Continuity: </ns0:t>
       </ns0:r>
       <ns0:r>
-        <ns0:t>Eliminated customer-visible downtime from third-party hardware freezes (which previously caused 20–40 minute outages) by engineering fault-tolerant communication state machines (Modbus TCP/RTU, OPC UA, MQTT) that automatically detect dropouts, quarantine bad sensor reads, and restore live device state upon reboot.</ns0:t>
+        <ns0:t>Eliminated customer-visible downtime from third-party hardware freezes (which previously caused 20–40 minute outages) by engineering fault-tolerant communication state machines (Modbus TCP/RTU, OPC UA, MQTT) that automatically detect dropouts, quarantine bad sensor reads, and restore live device state upon reboot to ensure continuous operational resilience.</ns0:t>
       </ns0:r>
     </ns0:p>
     <ns0:p>
@@ -476,10 +476,10 @@
         <ns0:rPr>
           <ns0:b/>
         </ns0:rPr>
-        <ns0:t xml:space="preserve">Hardware-to-Cloud Telemetry Integration: </ns0:t>
+        <ns0:t xml:space="preserve">Secure Hardware-to-Cloud Telemetry Integration: </ns0:t>
       </ns0:r>
       <ns0:r>
-        <ns0:t>Developed production Python, C++, and Bash background services on Linux edge devices to connect multi-vendor sensors, variable-rate pumps/actuators, and PLCs (OPC UA, Modbus, LoRa, Analog/Digital I/O), streaming real-time operational data to Azure IoT via MQTT.</ns0:t>
+        <ns0:t>Developed production Python, C++, and Bash background services on Linux edge devices to connect multi-vendor sensors, variable-rate pumps/actuators, and PLCs (OPC UA, Modbus, LoRa, Analog/Digital I/O), streaming real-time operational telemetry to Azure IoT via MQTT.</ns0:t>
       </ns0:r>
     </ns0:p>
     <ns0:p>
@@ -491,10 +491,10 @@
         <ns0:rPr>
           <ns0:b/>
         </ns0:rPr>
-        <ns0:t xml:space="preserve">Field Network Architecture &amp; Automated Provisioning: </ns0:t>
+        <ns0:t xml:space="preserve">Field Network Segmentation &amp; Automated Provisioning: </ns0:t>
       </ns0:r>
       <ns0:r>
-        <ns0:t>Designed secure local and cellular/LoRa field networks across industrial routers (Cradlepoint, Teltonika, MultiTech, Milesight) and headless Linux devices—configuring DHCP, NAT/port forwarding, and automated provisioning scripts to cut hardware setup time and enable remote diagnostics in hard-to-reach facilities.</ns0:t>
+        <ns0:t>Designed segmented local and cellular/LoRa field networks across industrial routers (Cradlepoint, Teltonika, MultiTech, Milesight) and headless Linux devices—configuring subnet routing, DHCP, NAT/port forwarding, and automated provisioning scripts to cut hardware setup time and enable secure remote diagnostics in industrial facilities.</ns0:t>
       </ns0:r>
     </ns0:p>
     <ns0:p>
@@ -531,10 +531,10 @@
         <ns0:rPr>
           <ns0:b/>
         </ns0:rPr>
-        <ns0:t xml:space="preserve">Federal Reporting Automation: </ns0:t>
+        <ns0:t xml:space="preserve">Federal U.S. EPA Reporting Automation: </ns0:t>
       </ns0:r>
       <ns0:r>
-        <ns0:t>Designed and deployed an automated Python and XML data pipeline to aggregate, validate, and generate federal EPA production reports—saving hundreds of engineering hours annually and eliminating manual spreadsheet errors.</ns0:t>
+        <ns0:t>Designed and deployed an automated Python and XML data pipeline to aggregate, validate, and generate federal U.S. Environmental Protection Agency (EPA) production reports—saving hundreds of engineering hours annually and eliminating manual spreadsheet errors.</ns0:t>
       </ns0:r>
     </ns0:p>
     <ns0:p>
@@ -546,10 +546,10 @@
         <ns0:rPr>
           <ns0:b/>
         </ns0:rPr>
-        <ns0:t xml:space="preserve">Automated Compliance Auditing: </ns0:t>
+        <ns0:t xml:space="preserve">Automated Regulatory Compliance Auditing: </ns0:t>
       </ns0:r>
       <ns0:r>
-        <ns0:t>Built custom Python document-parsing and diffing tools to audit registered product labels against regulatory standards, removing manual review bottlenecks while reducing compliance risk.</ns0:t>
+        <ns0:t>Built custom Python document-parsing and diffing tools to audit registered product labels against federal regulatory standards, removing manual review bottlenecks while reducing compliance risk.</ns0:t>
       </ns0:r>
     </ns0:p>
     <ns0:p>
@@ -620,7 +620,7 @@
         <ns0:t xml:space="preserve">Interactive Control Systems &amp; Robotics Simulators (bernalgorithm.github.io/bernalgorithm): </ns0:t>
       </ns0:r>
       <ns0:r>
-        <ns0:t>Built a Next.js / TypeScript engineering portfolio featuring real-time 60 FPS browser simulations—including a 3D 4-DOF Robotic Arm Inverse Kinematics Planner and a Closed-Loop PID Process Control Lab with interactive disturbance testing and digital oscilloscope telemetry—plus technical case studies on fault-tolerant IoT architecture and offline-first cloud sync.</ns0:t>
+        <ns0:t>Built a Next.js / TypeScript engineering portfolio featuring real-time 60 FPS browser simulations—including a 3D 4-DOF Robotic Arm Inverse Kinematics Planner and a Closed-Loop PID Process Control Lab with interactive disturbance testing and digital oscilloscope telemetry—plus technical case studies on fault-tolerant IoT/OT architecture and offline-first cloud sync.</ns0:t>
       </ns0:r>
     </ns0:p>
     <ns0:p>
@@ -716,7 +716,7 @@
         <ns0:t xml:space="preserve">NSF Computational Research: </ns0:t>
       </ns0:r>
       <ns0:r>
-        <ns0:t>Awarded National Science Foundation (NSF) funding to model and analyze molecular energy profiles on high-performance Linux supercomputing clusters.</ns0:t>
+        <ns0:t>Awarded federal National Science Foundation (NSF) research funding to model and analyze molecular energy profiles on high-performance Linux supercomputing clusters.</ns0:t>
       </ns0:r>
     </ns0:p>
     <ns0:sectPr ns0:rsidR="00FC693F" ns0:rsidRPr="0006063C" ns0:rsidSect="00034616">

</xml_diff>

<commit_message>
Frame simulators and articles as independent hobby explorations and remove robotics from professional bio
</commit_message>
<xml_diff>
--- a/my-next-app/public/Alexander_Bernal_Resume.docx
+++ b/my-next-app/public/Alexander_Bernal_Resume.docx
@@ -617,10 +617,10 @@
         <ns0:rPr>
           <ns0:b/>
         </ns0:rPr>
-        <ns0:t xml:space="preserve">Interactive Control Systems &amp; Robotics Simulators (bernalgorithm.github.io/bernalgorithm): </ns0:t>
+        <ns0:t xml:space="preserve">Personal Engineering Sandbox &amp; Hobby Simulators (bernalgorithm.github.io/bernalgorithm): </ns0:t>
       </ns0:r>
       <ns0:r>
-        <ns0:t>Built a Next.js / TypeScript engineering portfolio featuring real-time 60 FPS browser simulations—including a 3D 4-DOF Robotic Arm Inverse Kinematics Planner and a Closed-Loop PID Process Control Lab with interactive disturbance testing and digital oscilloscope telemetry—plus technical case studies on fault-tolerant IoT/OT architecture and offline-first cloud sync.</ns0:t>
+        <ns0:t>Built an independent Next.js / TypeScript portfolio and hobby lab featuring real-time 60 FPS browser simulations—including a Closed-Loop PID Process Control Simulator and a personal math exploration of 3D 4-DOF Inverse Kinematics—plus independent articles on state-machine design and offline-first cloud sync.</ns0:t>
       </ns0:r>
     </ns0:p>
     <ns0:p>

</xml_diff>